<commit_message>
Documento terminado, esperando revisiones
</commit_message>
<xml_diff>
--- a/AVANCE DE ESCRITURA JUNIO/REFERENCIAS/ESCRITURA-BASE-REV1.docx
+++ b/AVANCE DE ESCRITURA JUNIO/REFERENCIAS/ESCRITURA-BASE-REV1.docx
@@ -57,10 +57,10 @@
         <w:br w:type="page"/>
       </w:r>
     </w:p>
-    <w:bookmarkStart w:id="28" w:name="capítulo-1.-introducción"/>
+    <w:bookmarkStart w:id="23" w:name="configuración-y-calibración-de-gnlpda"/>
     <w:p>
       <w:pPr>
-        <w:pStyle w:val="Ttulo1"/>
+        <w:pStyle w:val="Ttulo2"/>
       </w:pPr>
       <w:r>
         <w:rPr>
@@ -72,13 +72,34 @@
         <w:tab/>
       </w:r>
       <w:r>
-        <w:t xml:space="preserve">Capítulo 1. Introducción</w:t>
+        <w:t xml:space="preserve">4.2 Configuración y calibración de GNLPDA</w:t>
       </w:r>
     </w:p>
-    <w:bookmarkStart w:id="20" w:name="contexto-y-motivación"/>
     <w:p>
       <w:pPr>
-        <w:pStyle w:val="Ttulo2"/>
+        <w:pStyle w:val="FirstParagraph"/>
+      </w:pPr>
+      <w:r>
+        <w:t xml:space="preserve">Una vez definida la arquitectura general de GNLPDA, fue necesario establecer la configuración del algoritmo genético utilizado en ambas fases de selección. Dado que el desempeño de los algoritmos evolutivos puede depender de la elección de sus parámetros de control, se realizó una calibración automática mediante</w:t>
+      </w:r>
+      <w:r>
+        <w:t xml:space="preserve"> </w:t>
+      </w:r>
+      <w:r>
+        <w:rPr>
+          <w:i/>
+          <w:iCs/>
+        </w:rPr>
+        <w:t xml:space="preserve">irace</w:t>
+      </w:r>
+      <w:r>
+        <w:t xml:space="preserve">, con el propósito de identificar una configuración adecuada para el problema de selección de características considerado en esta investigación (López-Ibáñez et al., 2016).</w:t>
+      </w:r>
+    </w:p>
+    <w:bookmarkStart w:id="20" w:name="parámetros-del-algoritmo-genético"/>
+    <w:p>
+      <w:pPr>
+        <w:pStyle w:val="Ttulo3"/>
       </w:pPr>
       <w:r>
         <w:rPr>
@@ -90,14 +111,431 @@
         <w:tab/>
       </w:r>
       <w:r>
-        <w:t xml:space="preserve">Contexto y motivación</w:t>
+        <w:t xml:space="preserve">4.2.1 Parámetros del algoritmo genético</w:t>
       </w:r>
     </w:p>
+    <w:p>
+      <w:pPr>
+        <w:pStyle w:val="FirstParagraph"/>
+      </w:pPr>
+      <w:r>
+        <w:t xml:space="preserve">El algoritmo genético empleado en GNLPDA utiliza una representación binaria pura. En ambas fases, cada cromosoma se codifica como un vector de ceros y unos, donde el valor 1 indica la inclusión de una variable o término, y el valor 0 indica su exclusión. En la primera fase, los genes representan variables originales; en la segunda fase, representan términos del espacio polinomial restringido.</w:t>
+      </w:r>
+    </w:p>
+    <w:p>
+      <w:pPr>
+        <w:pStyle w:val="Textoindependiente"/>
+      </w:pPr>
+      <w:r>
+        <w:t xml:space="preserve">La selección de individuos se realiza mediante torneo binario. En este esquema, dos individuos son seleccionados aleatoriamente de la población y compiten con base en su valor de aptitud; el individuo con mejor</w:t>
+      </w:r>
+      <w:r>
+        <w:t xml:space="preserve"> </w:t>
+      </w:r>
+      <w:r>
+        <w:rPr>
+          <w:i/>
+          <w:iCs/>
+        </w:rPr>
+        <w:t xml:space="preserve">fitness</w:t>
+      </w:r>
+      <w:r>
+        <w:t xml:space="preserve"> </w:t>
+      </w:r>
+      <w:r>
+        <w:t xml:space="preserve">tiene mayor probabilidad de ser elegido como progenitor. Para la recombinación, se emplea cruza de un solo punto, mientras que la mutación se implementa como inversión de bits sobre la representación binaria. Además, se incorpora elitismo, preservando automáticamente los dos mejores individuos de cada generación para la generación siguiente. Esta estrategia evita que las mejores soluciones encontradas se pierdan por efecto de los operadores estocásticos.</w:t>
+      </w:r>
+    </w:p>
+    <w:p>
+      <w:pPr>
+        <w:pStyle w:val="Textoindependiente"/>
+      </w:pPr>
+      <w:r>
+        <w:t xml:space="preserve">Los parámetros de control del algoritmo genético son comunes para ambas fases de GNLPDA. Es decir, la Fase I y la Fase II utilizan el mismo número de generaciones, tamaño de población, probabilidad de cruza, probabilidad de mutación y valor de penalización (</w:t>
+      </w:r>
+      <m:oMath>
+        <m:r>
+          <m:t>λ</m:t>
+        </m:r>
+      </m:oMath>
+      <w:r>
+        <w:t xml:space="preserve">). La diferencia entre fases está determinada por el espacio de búsqueda: variables originales en la primera fase y términos polinomiales en la segunda.</w:t>
+      </w:r>
+    </w:p>
+    <w:p>
+      <w:pPr>
+        <w:pStyle w:val="Textoindependiente"/>
+      </w:pPr>
+      <w:r>
+        <w:rPr>
+          <w:b/>
+          <w:bCs/>
+        </w:rPr>
+        <w:t xml:space="preserve">Tabla 4.1. Parámetros finales del algoritmo genético empleado en GNLPDA</w:t>
+      </w:r>
+    </w:p>
+    <w:tbl>
+      <w:tblPr>
+        <w:tblStyle w:val="Table"/>
+        <w:tblW w:type="auto" w:w="0"/>
+        <w:tblLook w:firstRow="1" w:lastRow="0" w:firstColumn="0" w:lastColumn="0" w:noHBand="0" w:noVBand="0" w:val="0020"/>
+      </w:tblPr>
+      <w:tblGrid>
+        <w:gridCol w:w="3960"/>
+        <w:gridCol w:w="3960"/>
+      </w:tblGrid>
+      <w:tr>
+        <w:trPr>
+          <w:tblHeader w:val="on"/>
+        </w:trPr>
+        <w:tc>
+          <w:tcPr/>
+          <w:p>
+            <w:pPr>
+              <w:pStyle w:val="Compact"/>
+              <w:jc w:val="left"/>
+            </w:pPr>
+            <w:r>
+              <w:t xml:space="preserve">Parámetro</w:t>
+            </w:r>
+          </w:p>
+        </w:tc>
+        <w:tc>
+          <w:tcPr/>
+          <w:p>
+            <w:pPr>
+              <w:pStyle w:val="Compact"/>
+              <w:jc w:val="left"/>
+            </w:pPr>
+            <w:r>
+              <w:t xml:space="preserve">Valor final</w:t>
+            </w:r>
+          </w:p>
+        </w:tc>
+      </w:tr>
+      <w:tr>
+        <w:tc>
+          <w:tcPr/>
+          <w:p>
+            <w:pPr>
+              <w:pStyle w:val="Compact"/>
+              <w:jc w:val="left"/>
+            </w:pPr>
+            <w:r>
+              <w:t xml:space="preserve">Número de generaciones (</w:t>
+            </w:r>
+            <m:oMath>
+              <m:sSub>
+                <m:e>
+                  <m:r>
+                    <m:t>n</m:t>
+                  </m:r>
+                </m:e>
+                <m:sub>
+                  <m:r>
+                    <m:rPr>
+                      <m:nor/>
+                      <m:sty m:val="p"/>
+                    </m:rPr>
+                    <m:t>gen</m:t>
+                  </m:r>
+                </m:sub>
+              </m:sSub>
+            </m:oMath>
+            <w:r>
+              <w:t xml:space="preserve">)</w:t>
+            </w:r>
+          </w:p>
+        </w:tc>
+        <w:tc>
+          <w:tcPr/>
+          <w:p>
+            <w:pPr>
+              <w:pStyle w:val="Compact"/>
+              <w:jc w:val="left"/>
+            </w:pPr>
+            <w:r>
+              <w:t xml:space="preserve">94</w:t>
+            </w:r>
+          </w:p>
+        </w:tc>
+      </w:tr>
+      <w:tr>
+        <w:tc>
+          <w:tcPr/>
+          <w:p>
+            <w:pPr>
+              <w:pStyle w:val="Compact"/>
+              <w:jc w:val="left"/>
+            </w:pPr>
+            <w:r>
+              <w:t xml:space="preserve">Tamaño de población (</w:t>
+            </w:r>
+            <m:oMath>
+              <m:r>
+                <m:rPr>
+                  <m:nor/>
+                  <m:sty m:val="p"/>
+                </m:rPr>
+                <m:t>tam_pop</m:t>
+              </m:r>
+            </m:oMath>
+            <w:r>
+              <w:t xml:space="preserve">)</w:t>
+            </w:r>
+          </w:p>
+        </w:tc>
+        <w:tc>
+          <w:tcPr/>
+          <w:p>
+            <w:pPr>
+              <w:pStyle w:val="Compact"/>
+              <w:jc w:val="left"/>
+            </w:pPr>
+            <w:r>
+              <w:t xml:space="preserve">64</w:t>
+            </w:r>
+          </w:p>
+        </w:tc>
+      </w:tr>
+      <w:tr>
+        <w:tc>
+          <w:tcPr/>
+          <w:p>
+            <w:pPr>
+              <w:pStyle w:val="Compact"/>
+              <w:jc w:val="left"/>
+            </w:pPr>
+            <w:r>
+              <w:t xml:space="preserve">Probabilidad de cruza (</w:t>
+            </w:r>
+            <m:oMath>
+              <m:sSub>
+                <m:e>
+                  <m:r>
+                    <m:t>p</m:t>
+                  </m:r>
+                </m:e>
+                <m:sub>
+                  <m:r>
+                    <m:rPr>
+                      <m:nor/>
+                      <m:sty m:val="p"/>
+                    </m:rPr>
+                    <m:t>cruza</m:t>
+                  </m:r>
+                </m:sub>
+              </m:sSub>
+            </m:oMath>
+            <w:r>
+              <w:t xml:space="preserve">)</w:t>
+            </w:r>
+          </w:p>
+        </w:tc>
+        <w:tc>
+          <w:tcPr/>
+          <w:p>
+            <w:pPr>
+              <w:pStyle w:val="Compact"/>
+              <w:jc w:val="left"/>
+            </w:pPr>
+            <w:r>
+              <w:t xml:space="preserve">0.90</w:t>
+            </w:r>
+          </w:p>
+        </w:tc>
+      </w:tr>
+      <w:tr>
+        <w:tc>
+          <w:tcPr/>
+          <w:p>
+            <w:pPr>
+              <w:pStyle w:val="Compact"/>
+              <w:jc w:val="left"/>
+            </w:pPr>
+            <w:r>
+              <w:t xml:space="preserve">Probabilidad de mutación (</w:t>
+            </w:r>
+            <m:oMath>
+              <m:sSub>
+                <m:e>
+                  <m:r>
+                    <m:t>p</m:t>
+                  </m:r>
+                </m:e>
+                <m:sub>
+                  <m:r>
+                    <m:rPr>
+                      <m:nor/>
+                      <m:sty m:val="p"/>
+                    </m:rPr>
+                    <m:t>mut</m:t>
+                  </m:r>
+                </m:sub>
+              </m:sSub>
+            </m:oMath>
+            <w:r>
+              <w:t xml:space="preserve">)</w:t>
+            </w:r>
+          </w:p>
+        </w:tc>
+        <w:tc>
+          <w:tcPr/>
+          <w:p>
+            <w:pPr>
+              <w:pStyle w:val="Compact"/>
+              <w:jc w:val="left"/>
+            </w:pPr>
+            <w:r>
+              <w:t xml:space="preserve">0.05</w:t>
+            </w:r>
+          </w:p>
+        </w:tc>
+      </w:tr>
+      <w:tr>
+        <w:tc>
+          <w:tcPr/>
+          <w:p>
+            <w:pPr>
+              <w:pStyle w:val="Compact"/>
+              <w:jc w:val="left"/>
+            </w:pPr>
+            <w:r>
+              <w:t xml:space="preserve">Penalización por complejidad (</w:t>
+            </w:r>
+            <m:oMath>
+              <m:r>
+                <m:t>λ</m:t>
+              </m:r>
+            </m:oMath>
+            <w:r>
+              <w:t xml:space="preserve">)</w:t>
+            </w:r>
+          </w:p>
+        </w:tc>
+        <w:tc>
+          <w:tcPr/>
+          <w:p>
+            <w:pPr>
+              <w:pStyle w:val="Compact"/>
+              <w:jc w:val="left"/>
+            </w:pPr>
+            <w:r>
+              <w:t xml:space="preserve">0.01</w:t>
+            </w:r>
+          </w:p>
+        </w:tc>
+      </w:tr>
+      <w:tr>
+        <w:tc>
+          <w:tcPr/>
+          <w:p>
+            <w:pPr>
+              <w:pStyle w:val="Compact"/>
+              <w:jc w:val="left"/>
+            </w:pPr>
+            <w:r>
+              <w:t xml:space="preserve">Selección</w:t>
+            </w:r>
+          </w:p>
+        </w:tc>
+        <w:tc>
+          <w:tcPr/>
+          <w:p>
+            <w:pPr>
+              <w:pStyle w:val="Compact"/>
+              <w:jc w:val="left"/>
+            </w:pPr>
+            <w:r>
+              <w:t xml:space="preserve">Torneo binario</w:t>
+            </w:r>
+          </w:p>
+        </w:tc>
+      </w:tr>
+      <w:tr>
+        <w:tc>
+          <w:tcPr/>
+          <w:p>
+            <w:pPr>
+              <w:pStyle w:val="Compact"/>
+              <w:jc w:val="left"/>
+            </w:pPr>
+            <w:r>
+              <w:t xml:space="preserve">Cruza</w:t>
+            </w:r>
+          </w:p>
+        </w:tc>
+        <w:tc>
+          <w:tcPr/>
+          <w:p>
+            <w:pPr>
+              <w:pStyle w:val="Compact"/>
+              <w:jc w:val="left"/>
+            </w:pPr>
+            <w:r>
+              <w:t xml:space="preserve">Un punto</w:t>
+            </w:r>
+          </w:p>
+        </w:tc>
+      </w:tr>
+      <w:tr>
+        <w:tc>
+          <w:tcPr/>
+          <w:p>
+            <w:pPr>
+              <w:pStyle w:val="Compact"/>
+              <w:jc w:val="left"/>
+            </w:pPr>
+            <w:r>
+              <w:t xml:space="preserve">Representación</w:t>
+            </w:r>
+          </w:p>
+        </w:tc>
+        <w:tc>
+          <w:tcPr/>
+          <w:p>
+            <w:pPr>
+              <w:pStyle w:val="Compact"/>
+              <w:jc w:val="left"/>
+            </w:pPr>
+            <w:r>
+              <w:t xml:space="preserve">Binaria</w:t>
+            </w:r>
+          </w:p>
+        </w:tc>
+      </w:tr>
+      <w:tr>
+        <w:tc>
+          <w:tcPr/>
+          <w:p>
+            <w:pPr>
+              <w:pStyle w:val="Compact"/>
+              <w:jc w:val="left"/>
+            </w:pPr>
+            <w:r>
+              <w:t xml:space="preserve">Elitismo</w:t>
+            </w:r>
+          </w:p>
+        </w:tc>
+        <w:tc>
+          <w:tcPr/>
+          <w:p>
+            <w:pPr>
+              <w:pStyle w:val="Compact"/>
+              <w:jc w:val="left"/>
+            </w:pPr>
+            <w:r>
+              <w:t xml:space="preserve">2 mejores individuos</w:t>
+            </w:r>
+          </w:p>
+        </w:tc>
+      </w:tr>
+    </w:tbl>
     <w:bookmarkEnd w:id="20"/>
-    <w:bookmarkStart w:id="21" w:name="planteamiento-del-problema"/>
+    <w:bookmarkStart w:id="21" w:name="calibración-mediante-irace"/>
     <w:p>
       <w:pPr>
-        <w:pStyle w:val="Ttulo2"/>
+        <w:pStyle w:val="Ttulo3"/>
       </w:pPr>
       <w:r>
         <w:rPr>
@@ -109,14 +547,768 @@
         <w:tab/>
       </w:r>
       <w:r>
-        <w:t xml:space="preserve">Planteamiento del problema</w:t>
+        <w:t xml:space="preserve">4.2.2 Calibración mediante irace</w:t>
+      </w:r>
+    </w:p>
+    <w:p>
+      <w:pPr>
+        <w:pStyle w:val="FirstParagraph"/>
+      </w:pPr>
+      <w:r>
+        <w:t xml:space="preserve">La calibración de parámetros se realizó mediante</w:t>
+      </w:r>
+      <w:r>
+        <w:t xml:space="preserve"> </w:t>
+      </w:r>
+      <w:r>
+        <w:rPr>
+          <w:i/>
+          <w:iCs/>
+        </w:rPr>
+        <w:t xml:space="preserve">irace</w:t>
+      </w:r>
+      <w:r>
+        <w:t xml:space="preserve">, una herramienta de configuración automática basada en carreras iteradas. Este procedimiento evalúa distintas configuraciones candidatas sobre un conjunto de instancias de calibración y descarta progresivamente aquellas configuraciones con menor desempeño, concentrando el presupuesto de evaluación en las alternativas más prometedoras.</w:t>
+      </w:r>
+    </w:p>
+    <w:p>
+      <w:pPr>
+        <w:pStyle w:val="Textoindependiente"/>
+      </w:pPr>
+      <w:r>
+        <w:t xml:space="preserve">En esta investigación,</w:t>
+      </w:r>
+      <w:r>
+        <w:t xml:space="preserve"> </w:t>
+      </w:r>
+      <w:r>
+        <w:rPr>
+          <w:b/>
+          <w:bCs/>
+        </w:rPr>
+        <w:t xml:space="preserve">irace</w:t>
+      </w:r>
+      <w:r>
+        <w:t xml:space="preserve"> </w:t>
+      </w:r>
+      <w:r>
+        <w:t xml:space="preserve">fue utilizado para calibrar cinco parámetros principales de GNLPDA: probabilidad de mutación, tamaño de población, probabilidad de cruza, penalización por complejidad y número de generaciones. Los rangos de búsqueda considerados fueron los siguientes:</w:t>
+      </w:r>
+    </w:p>
+    <w:p>
+      <w:pPr>
+        <w:pStyle w:val="Textoindependiente"/>
+      </w:pPr>
+      <w:r>
+        <w:rPr>
+          <w:b/>
+          <w:bCs/>
+        </w:rPr>
+        <w:t xml:space="preserve">Tabla 4.2. Rangos de calibración considerados por irace</w:t>
+      </w:r>
+    </w:p>
+    <w:tbl>
+      <w:tblPr>
+        <w:tblStyle w:val="Table"/>
+        <w:tblW w:type="auto" w:w="0"/>
+        <w:tblLook w:firstRow="1" w:lastRow="0" w:firstColumn="0" w:lastColumn="0" w:noHBand="0" w:noVBand="0" w:val="0020"/>
+      </w:tblPr>
+      <w:tblGrid>
+        <w:gridCol w:w="2640"/>
+        <w:gridCol w:w="2640"/>
+        <w:gridCol w:w="2640"/>
+      </w:tblGrid>
+      <w:tr>
+        <w:trPr>
+          <w:tblHeader w:val="on"/>
+        </w:trPr>
+        <w:tc>
+          <w:tcPr/>
+          <w:p>
+            <w:pPr>
+              <w:pStyle w:val="Compact"/>
+              <w:jc w:val="left"/>
+            </w:pPr>
+            <w:r>
+              <w:t xml:space="preserve">Parámetro</w:t>
+            </w:r>
+          </w:p>
+        </w:tc>
+        <w:tc>
+          <w:tcPr/>
+          <w:p>
+            <w:pPr>
+              <w:pStyle w:val="Compact"/>
+              <w:jc w:val="left"/>
+            </w:pPr>
+            <w:r>
+              <w:t xml:space="preserve">Tipo</w:t>
+            </w:r>
+          </w:p>
+        </w:tc>
+        <w:tc>
+          <w:tcPr/>
+          <w:p>
+            <w:pPr>
+              <w:pStyle w:val="Compact"/>
+              <w:jc w:val="left"/>
+            </w:pPr>
+            <w:r>
+              <w:t xml:space="preserve">Rango de búsqueda</w:t>
+            </w:r>
+          </w:p>
+        </w:tc>
+      </w:tr>
+      <w:tr>
+        <w:tc>
+          <w:tcPr/>
+          <w:p>
+            <w:pPr>
+              <w:pStyle w:val="Compact"/>
+              <w:jc w:val="left"/>
+            </w:pPr>
+            <m:oMath>
+              <m:sSub>
+                <m:e>
+                  <m:r>
+                    <m:t>p</m:t>
+                  </m:r>
+                </m:e>
+                <m:sub>
+                  <m:r>
+                    <m:rPr>
+                      <m:nor/>
+                      <m:sty m:val="p"/>
+                    </m:rPr>
+                    <m:t>mut</m:t>
+                  </m:r>
+                </m:sub>
+              </m:sSub>
+            </m:oMath>
+          </w:p>
+        </w:tc>
+        <w:tc>
+          <w:tcPr/>
+          <w:p>
+            <w:pPr>
+              <w:pStyle w:val="Compact"/>
+              <w:jc w:val="left"/>
+            </w:pPr>
+            <w:r>
+              <w:t xml:space="preserve">Real</w:t>
+            </w:r>
+          </w:p>
+        </w:tc>
+        <w:tc>
+          <w:tcPr/>
+          <w:p>
+            <w:pPr>
+              <w:pStyle w:val="Compact"/>
+              <w:jc w:val="left"/>
+            </w:pPr>
+            <m:oMath>
+              <m:d>
+                <m:dPr>
+                  <m:begChr m:val="["/>
+                  <m:sepChr m:val=""/>
+                  <m:endChr m:val="]"/>
+                  <m:grow/>
+                </m:dPr>
+                <m:e>
+                  <m:r>
+                    <m:t>0.05</m:t>
+                  </m:r>
+                  <m:r>
+                    <m:rPr>
+                      <m:sty m:val="p"/>
+                    </m:rPr>
+                    <m:t>,</m:t>
+                  </m:r>
+                  <m:r>
+                    <m:t>0.20</m:t>
+                  </m:r>
+                </m:e>
+              </m:d>
+            </m:oMath>
+          </w:p>
+        </w:tc>
+      </w:tr>
+      <w:tr>
+        <w:tc>
+          <w:tcPr/>
+          <w:p>
+            <w:pPr>
+              <w:pStyle w:val="Compact"/>
+              <w:jc w:val="left"/>
+            </w:pPr>
+            <m:oMath>
+              <m:r>
+                <m:rPr>
+                  <m:nor/>
+                  <m:sty m:val="p"/>
+                </m:rPr>
+                <m:t>popSize</m:t>
+              </m:r>
+            </m:oMath>
+          </w:p>
+        </w:tc>
+        <w:tc>
+          <w:tcPr/>
+          <w:p>
+            <w:pPr>
+              <w:pStyle w:val="Compact"/>
+              <w:jc w:val="left"/>
+            </w:pPr>
+            <w:r>
+              <w:t xml:space="preserve">Entero</w:t>
+            </w:r>
+          </w:p>
+        </w:tc>
+        <w:tc>
+          <w:tcPr/>
+          <w:p>
+            <w:pPr>
+              <w:pStyle w:val="Compact"/>
+              <w:jc w:val="left"/>
+            </w:pPr>
+            <m:oMath>
+              <m:d>
+                <m:dPr>
+                  <m:begChr m:val="["/>
+                  <m:sepChr m:val=""/>
+                  <m:endChr m:val="]"/>
+                  <m:grow/>
+                </m:dPr>
+                <m:e>
+                  <m:r>
+                    <m:t>20</m:t>
+                  </m:r>
+                  <m:r>
+                    <m:rPr>
+                      <m:sty m:val="p"/>
+                    </m:rPr>
+                    <m:t>,</m:t>
+                  </m:r>
+                  <m:r>
+                    <m:t>100</m:t>
+                  </m:r>
+                </m:e>
+              </m:d>
+            </m:oMath>
+          </w:p>
+        </w:tc>
+      </w:tr>
+      <w:tr>
+        <w:tc>
+          <w:tcPr/>
+          <w:p>
+            <w:pPr>
+              <w:pStyle w:val="Compact"/>
+              <w:jc w:val="left"/>
+            </w:pPr>
+            <m:oMath>
+              <m:sSub>
+                <m:e>
+                  <m:r>
+                    <m:t>p</m:t>
+                  </m:r>
+                </m:e>
+                <m:sub>
+                  <m:r>
+                    <m:rPr>
+                      <m:nor/>
+                      <m:sty m:val="p"/>
+                    </m:rPr>
+                    <m:t>cruza</m:t>
+                  </m:r>
+                </m:sub>
+              </m:sSub>
+            </m:oMath>
+          </w:p>
+        </w:tc>
+        <w:tc>
+          <w:tcPr/>
+          <w:p>
+            <w:pPr>
+              <w:pStyle w:val="Compact"/>
+              <w:jc w:val="left"/>
+            </w:pPr>
+            <w:r>
+              <w:t xml:space="preserve">Real</w:t>
+            </w:r>
+          </w:p>
+        </w:tc>
+        <w:tc>
+          <w:tcPr/>
+          <w:p>
+            <w:pPr>
+              <w:pStyle w:val="Compact"/>
+              <w:jc w:val="left"/>
+            </w:pPr>
+            <m:oMath>
+              <m:d>
+                <m:dPr>
+                  <m:begChr m:val="["/>
+                  <m:sepChr m:val=""/>
+                  <m:endChr m:val="]"/>
+                  <m:grow/>
+                </m:dPr>
+                <m:e>
+                  <m:r>
+                    <m:t>0.40</m:t>
+                  </m:r>
+                  <m:r>
+                    <m:rPr>
+                      <m:sty m:val="p"/>
+                    </m:rPr>
+                    <m:t>,</m:t>
+                  </m:r>
+                  <m:r>
+                    <m:t>0.95</m:t>
+                  </m:r>
+                </m:e>
+              </m:d>
+            </m:oMath>
+          </w:p>
+        </w:tc>
+      </w:tr>
+      <w:tr>
+        <w:tc>
+          <w:tcPr/>
+          <w:p>
+            <w:pPr>
+              <w:pStyle w:val="Compact"/>
+              <w:jc w:val="left"/>
+            </w:pPr>
+            <m:oMath>
+              <m:r>
+                <m:t>λ</m:t>
+              </m:r>
+            </m:oMath>
+          </w:p>
+        </w:tc>
+        <w:tc>
+          <w:tcPr/>
+          <w:p>
+            <w:pPr>
+              <w:pStyle w:val="Compact"/>
+              <w:jc w:val="left"/>
+            </w:pPr>
+            <w:r>
+              <w:t xml:space="preserve">Real</w:t>
+            </w:r>
+          </w:p>
+        </w:tc>
+        <w:tc>
+          <w:tcPr/>
+          <w:p>
+            <w:pPr>
+              <w:pStyle w:val="Compact"/>
+              <w:jc w:val="left"/>
+            </w:pPr>
+            <m:oMath>
+              <m:d>
+                <m:dPr>
+                  <m:begChr m:val="["/>
+                  <m:sepChr m:val=""/>
+                  <m:endChr m:val="]"/>
+                  <m:grow/>
+                </m:dPr>
+                <m:e>
+                  <m:r>
+                    <m:t>0.01</m:t>
+                  </m:r>
+                  <m:r>
+                    <m:rPr>
+                      <m:sty m:val="p"/>
+                    </m:rPr>
+                    <m:t>,</m:t>
+                  </m:r>
+                  <m:r>
+                    <m:t>0.20</m:t>
+                  </m:r>
+                </m:e>
+              </m:d>
+            </m:oMath>
+          </w:p>
+        </w:tc>
+      </w:tr>
+      <w:tr>
+        <w:tc>
+          <w:tcPr/>
+          <w:p>
+            <w:pPr>
+              <w:pStyle w:val="Compact"/>
+              <w:jc w:val="left"/>
+            </w:pPr>
+            <m:oMath>
+              <m:sSub>
+                <m:e>
+                  <m:r>
+                    <m:t>n</m:t>
+                  </m:r>
+                </m:e>
+                <m:sub>
+                  <m:r>
+                    <m:rPr>
+                      <m:nor/>
+                      <m:sty m:val="p"/>
+                    </m:rPr>
+                    <m:t>gen</m:t>
+                  </m:r>
+                </m:sub>
+              </m:sSub>
+            </m:oMath>
+          </w:p>
+        </w:tc>
+        <w:tc>
+          <w:tcPr/>
+          <w:p>
+            <w:pPr>
+              <w:pStyle w:val="Compact"/>
+              <w:jc w:val="left"/>
+            </w:pPr>
+            <w:r>
+              <w:t xml:space="preserve">Entero</w:t>
+            </w:r>
+          </w:p>
+        </w:tc>
+        <w:tc>
+          <w:tcPr/>
+          <w:p>
+            <w:pPr>
+              <w:pStyle w:val="Compact"/>
+              <w:jc w:val="left"/>
+            </w:pPr>
+            <m:oMath>
+              <m:d>
+                <m:dPr>
+                  <m:begChr m:val="["/>
+                  <m:sepChr m:val=""/>
+                  <m:endChr m:val="]"/>
+                  <m:grow/>
+                </m:dPr>
+                <m:e>
+                  <m:r>
+                    <m:t>20</m:t>
+                  </m:r>
+                  <m:r>
+                    <m:rPr>
+                      <m:sty m:val="p"/>
+                    </m:rPr>
+                    <m:t>,</m:t>
+                  </m:r>
+                  <m:r>
+                    <m:t>100</m:t>
+                  </m:r>
+                </m:e>
+              </m:d>
+            </m:oMath>
+          </w:p>
+        </w:tc>
+      </w:tr>
+    </w:tbl>
+    <w:p>
+      <w:pPr>
+        <w:pStyle w:val="Textoindependiente"/>
+      </w:pPr>
+      <w:r>
+        <w:t xml:space="preserve">Dado que</w:t>
+      </w:r>
+      <w:r>
+        <w:t xml:space="preserve"> </w:t>
+      </w:r>
+      <w:r>
+        <w:rPr>
+          <w:i/>
+          <w:iCs/>
+        </w:rPr>
+        <w:t xml:space="preserve">irace</w:t>
+      </w:r>
+      <w:r>
+        <w:t xml:space="preserve"> </w:t>
+      </w:r>
+      <w:r>
+        <w:t xml:space="preserve">opera como un procedimiento de minimización, el criterio objetivo se definió a partir del</w:t>
+      </w:r>
+      <w:r>
+        <w:t xml:space="preserve"> </w:t>
+      </w:r>
+      <w:r>
+        <w:rPr>
+          <w:i/>
+          <w:iCs/>
+        </w:rPr>
+        <w:t xml:space="preserve">fitness</w:t>
+      </w:r>
+      <w:r>
+        <w:t xml:space="preserve"> </w:t>
+      </w:r>
+      <w:r>
+        <w:t xml:space="preserve">penalizado obtenido por GNLPDA al finalizar la segunda etapa. En particular, para cada configuración candidata se ejecutó el procedimiento completo de dos fases y se tomó el mejor valor de aptitud obtenido en la Fase II, denotado como</w:t>
+      </w:r>
+      <w:r>
+        <w:t xml:space="preserve"> </w:t>
+      </w:r>
+      <m:oMath>
+        <m:sSub>
+          <m:e>
+            <m:r>
+              <m:t>F</m:t>
+            </m:r>
+          </m:e>
+          <m:sub>
+            <m:r>
+              <m:t>2</m:t>
+            </m:r>
+          </m:sub>
+        </m:sSub>
+        <m:d>
+          <m:dPr>
+            <m:begChr m:val="("/>
+            <m:sepChr m:val=""/>
+            <m:endChr m:val=")"/>
+            <m:grow/>
+          </m:dPr>
+          <m:e>
+            <m:sSup>
+              <m:e>
+                <m:r>
+                  <m:rPr>
+                    <m:sty m:val="b"/>
+                  </m:rPr>
+                  <m:t>z</m:t>
+                </m:r>
+              </m:e>
+              <m:sup>
+                <m:d>
+                  <m:dPr>
+                    <m:begChr m:val="("/>
+                    <m:sepChr m:val=""/>
+                    <m:endChr m:val=")"/>
+                    <m:grow/>
+                  </m:dPr>
+                  <m:e>
+                    <m:r>
+                      <m:t>2</m:t>
+                    </m:r>
+                  </m:e>
+                </m:d>
+                <m:r>
+                  <m:rPr>
+                    <m:sty m:val="p"/>
+                  </m:rPr>
+                  <m:t>*</m:t>
+                </m:r>
+              </m:sup>
+            </m:sSup>
+          </m:e>
+        </m:d>
+      </m:oMath>
+      <w:r>
+        <w:t xml:space="preserve">. A partir de este valor, la función de costo entregada a</w:t>
+      </w:r>
+      <w:r>
+        <w:t xml:space="preserve"> </w:t>
+      </w:r>
+      <w:r>
+        <w:rPr>
+          <w:i/>
+          <w:iCs/>
+        </w:rPr>
+        <w:t xml:space="preserve">irace</w:t>
+      </w:r>
+      <w:r>
+        <w:t xml:space="preserve"> </w:t>
+      </w:r>
+      <w:r>
+        <w:t xml:space="preserve">se definió como:</w:t>
+      </w:r>
+    </w:p>
+    <w:p>
+      <w:pPr>
+        <w:pStyle w:val="Textoindependiente"/>
+      </w:pPr>
+      <m:oMathPara>
+        <m:oMathParaPr>
+          <m:jc m:val="center"/>
+        </m:oMathParaPr>
+        <m:oMath>
+          <m:sSub>
+            <m:e>
+              <m:r>
+                <m:rPr>
+                  <m:sty m:val="p"/>
+                  <m:scr m:val="script"/>
+                </m:rPr>
+                <m:t>L</m:t>
+              </m:r>
+            </m:e>
+            <m:sub>
+              <m:r>
+                <m:t>i</m:t>
+              </m:r>
+              <m:r>
+                <m:t>r</m:t>
+              </m:r>
+              <m:r>
+                <m:t>a</m:t>
+              </m:r>
+              <m:r>
+                <m:t>c</m:t>
+              </m:r>
+              <m:r>
+                <m:t>e</m:t>
+              </m:r>
+            </m:sub>
+          </m:sSub>
+          <m:r>
+            <m:rPr>
+              <m:sty m:val="p"/>
+            </m:rPr>
+            <m:t>=</m:t>
+          </m:r>
+          <m:r>
+            <m:t>1</m:t>
+          </m:r>
+          <m:r>
+            <m:rPr>
+              <m:sty m:val="p"/>
+            </m:rPr>
+            <m:t>−</m:t>
+          </m:r>
+          <m:sSub>
+            <m:e>
+              <m:r>
+                <m:t>F</m:t>
+              </m:r>
+            </m:e>
+            <m:sub>
+              <m:r>
+                <m:t>2</m:t>
+              </m:r>
+            </m:sub>
+          </m:sSub>
+          <m:d>
+            <m:dPr>
+              <m:begChr m:val="("/>
+              <m:sepChr m:val=""/>
+              <m:endChr m:val=")"/>
+              <m:grow/>
+            </m:dPr>
+            <m:e>
+              <m:sSup>
+                <m:e>
+                  <m:r>
+                    <m:rPr>
+                      <m:sty m:val="b"/>
+                    </m:rPr>
+                    <m:t>z</m:t>
+                  </m:r>
+                </m:e>
+                <m:sup>
+                  <m:d>
+                    <m:dPr>
+                      <m:begChr m:val="("/>
+                      <m:sepChr m:val=""/>
+                      <m:endChr m:val=")"/>
+                      <m:grow/>
+                    </m:dPr>
+                    <m:e>
+                      <m:r>
+                        <m:t>2</m:t>
+                      </m:r>
+                    </m:e>
+                  </m:d>
+                  <m:r>
+                    <m:rPr>
+                      <m:sty m:val="p"/>
+                    </m:rPr>
+                    <m:t>*</m:t>
+                  </m:r>
+                </m:sup>
+              </m:sSup>
+            </m:e>
+          </m:d>
+        </m:oMath>
+      </m:oMathPara>
+    </w:p>
+    <w:p>
+      <w:pPr>
+        <w:pStyle w:val="FirstParagraph"/>
+      </w:pPr>
+      <w:r>
+        <w:t xml:space="preserve">De esta forma, minimizar</w:t>
+      </w:r>
+      <w:r>
+        <w:t xml:space="preserve"> </w:t>
+      </w:r>
+      <m:oMath>
+        <m:sSub>
+          <m:e>
+            <m:r>
+              <m:rPr>
+                <m:sty m:val="p"/>
+                <m:scr m:val="script"/>
+              </m:rPr>
+              <m:t>L</m:t>
+            </m:r>
+          </m:e>
+          <m:sub>
+            <m:r>
+              <m:t>i</m:t>
+            </m:r>
+            <m:r>
+              <m:t>r</m:t>
+            </m:r>
+            <m:r>
+              <m:t>a</m:t>
+            </m:r>
+            <m:r>
+              <m:t>c</m:t>
+            </m:r>
+            <m:r>
+              <m:t>e</m:t>
+            </m:r>
+          </m:sub>
+        </m:sSub>
+      </m:oMath>
+      <w:r>
+        <w:t xml:space="preserve"> </w:t>
+      </w:r>
+      <w:r>
+        <w:t xml:space="preserve">equivale a favorecer configuraciones que produzcan un mayor</w:t>
+      </w:r>
+      <w:r>
+        <w:t xml:space="preserve"> </w:t>
+      </w:r>
+      <w:r>
+        <w:rPr>
+          <w:i/>
+          <w:iCs/>
+        </w:rPr>
+        <w:t xml:space="preserve">fitness</w:t>
+      </w:r>
+      <w:r>
+        <w:t xml:space="preserve"> </w:t>
+      </w:r>
+      <w:r>
+        <w:t xml:space="preserve">penalizado en la segunda etapa. Este criterio incorpora simultáneamente la exactitud promedio estimada mediante validación cruzada estratificada de cinco pliegues y la penalización por complejidad asociada al número de términos polinomiales seleccionados.</w:t>
+      </w:r>
+    </w:p>
+    <w:p>
+      <w:pPr>
+        <w:pStyle w:val="Textoindependiente"/>
+      </w:pPr>
+      <w:r>
+        <w:t xml:space="preserve">El presupuesto máximo de calibración se fijó en 5000 experimentos. Para reducir el tiempo de ejecución, el proceso se paralelizó utilizando 11 núcleos de procesamiento.</w:t>
       </w:r>
     </w:p>
     <w:bookmarkEnd w:id="21"/>
-    <w:bookmarkStart w:id="22" w:name="hipótesis"/>
+    <w:bookmarkStart w:id="22" w:name="X234b51c22438e80ee179d2664d4e2011437e5f5"/>
     <w:p>
       <w:pPr>
-        <w:pStyle w:val="Ttulo2"/>
+        <w:pStyle w:val="Ttulo3"/>
       </w:pPr>
       <w:r>
         <w:rPr>
@@ -128,3051 +1320,416 @@
         <w:tab/>
       </w:r>
       <w:r>
-        <w:t xml:space="preserve">Hipótesis</w:t>
+        <w:t xml:space="preserve">4.2.3 Escenarios de calibración y configuración final</w:t>
+      </w:r>
+    </w:p>
+    <w:p>
+      <w:pPr>
+        <w:pStyle w:val="FirstParagraph"/>
+      </w:pPr>
+      <w:r>
+        <w:t xml:space="preserve">La calibración se realizó utilizando cuatro escenarios: Iris, Pima, Cebolla 3D y Cebolla 10D. Los conjuntos Iris y Pima se emplearon como conjuntos de referencia clásicos en clasificación supervisada, mientras que los escenarios Cebolla 3D y Cebolla 10D se incorporaron como casos sintéticos con estructura no lineal y geometría concéntrica. Esta combinación permitió que la calibración considerara tanto datos de referencia ampliamente utilizados como escenarios diseñados para exigir transformaciones no lineales del espacio de entrada.</w:t>
+      </w:r>
+    </w:p>
+    <w:p>
+      <w:pPr>
+        <w:pStyle w:val="Textoindependiente"/>
+      </w:pPr>
+      <w:r>
+        <w:t xml:space="preserve">La configuración seleccionada por</w:t>
+      </w:r>
+      <w:r>
+        <w:t xml:space="preserve"> </w:t>
+      </w:r>
+      <w:r>
+        <w:rPr>
+          <w:i/>
+          <w:iCs/>
+        </w:rPr>
+        <w:t xml:space="preserve">irace</w:t>
+      </w:r>
+      <w:r>
+        <w:t xml:space="preserve"> </w:t>
+      </w:r>
+      <w:r>
+        <w:t xml:space="preserve">fue posteriormente fijada y utilizada en las ejecuciones experimentales de GNLPDA. De esta forma, los parámetros del algoritmo no fueron ajustados manualmente para cada conjunto de datos, sino definidos previamente mediante un proceso automático de calibración.</w:t>
+      </w:r>
+    </w:p>
+    <w:p>
+      <w:pPr>
+        <w:pStyle w:val="Textoindependiente"/>
+      </w:pPr>
+      <w:r>
+        <w:t xml:space="preserve">La configuración final adoptada fue la siguiente:</w:t>
+      </w:r>
+    </w:p>
+    <w:tbl>
+      <w:tblPr>
+        <w:tblStyle w:val="Table"/>
+        <w:tblW w:type="auto" w:w="0"/>
+        <w:tblLook w:firstRow="1" w:lastRow="0" w:firstColumn="0" w:lastColumn="0" w:noHBand="0" w:noVBand="0" w:val="0020"/>
+      </w:tblPr>
+      <w:tblGrid>
+        <w:gridCol w:w="3960"/>
+        <w:gridCol w:w="3960"/>
+      </w:tblGrid>
+      <w:tr>
+        <w:trPr>
+          <w:tblHeader w:val="on"/>
+        </w:trPr>
+        <w:tc>
+          <w:tcPr/>
+          <w:p>
+            <w:pPr>
+              <w:pStyle w:val="Compact"/>
+              <w:jc w:val="left"/>
+            </w:pPr>
+            <w:r>
+              <w:t xml:space="preserve">Parámetro</w:t>
+            </w:r>
+          </w:p>
+        </w:tc>
+        <w:tc>
+          <w:tcPr/>
+          <w:p>
+            <w:pPr>
+              <w:pStyle w:val="Compact"/>
+              <w:jc w:val="left"/>
+            </w:pPr>
+            <w:r>
+              <w:t xml:space="preserve">Valor final</w:t>
+            </w:r>
+          </w:p>
+        </w:tc>
+      </w:tr>
+      <w:tr>
+        <w:tc>
+          <w:tcPr/>
+          <w:p>
+            <w:pPr>
+              <w:pStyle w:val="Compact"/>
+              <w:jc w:val="left"/>
+            </w:pPr>
+            <w:r>
+              <w:t xml:space="preserve">Número de generaciones (</w:t>
+            </w:r>
+            <m:oMath>
+              <m:sSub>
+                <m:e>
+                  <m:r>
+                    <m:t>n</m:t>
+                  </m:r>
+                </m:e>
+                <m:sub>
+                  <m:r>
+                    <m:rPr>
+                      <m:nor/>
+                      <m:sty m:val="p"/>
+                    </m:rPr>
+                    <m:t>gen</m:t>
+                  </m:r>
+                </m:sub>
+              </m:sSub>
+            </m:oMath>
+            <w:r>
+              <w:t xml:space="preserve">)</w:t>
+            </w:r>
+          </w:p>
+        </w:tc>
+        <w:tc>
+          <w:tcPr/>
+          <w:p>
+            <w:pPr>
+              <w:pStyle w:val="Compact"/>
+              <w:jc w:val="left"/>
+            </w:pPr>
+            <w:r>
+              <w:t xml:space="preserve">94</w:t>
+            </w:r>
+          </w:p>
+        </w:tc>
+      </w:tr>
+      <w:tr>
+        <w:tc>
+          <w:tcPr/>
+          <w:p>
+            <w:pPr>
+              <w:pStyle w:val="Compact"/>
+              <w:jc w:val="left"/>
+            </w:pPr>
+            <w:r>
+              <w:t xml:space="preserve">Tamaño de población (</w:t>
+            </w:r>
+            <m:oMath>
+              <m:r>
+                <m:rPr>
+                  <m:nor/>
+                  <m:sty m:val="p"/>
+                </m:rPr>
+                <m:t>tam_pop</m:t>
+              </m:r>
+            </m:oMath>
+            <w:r>
+              <w:t xml:space="preserve">)</w:t>
+            </w:r>
+          </w:p>
+        </w:tc>
+        <w:tc>
+          <w:tcPr/>
+          <w:p>
+            <w:pPr>
+              <w:pStyle w:val="Compact"/>
+              <w:jc w:val="left"/>
+            </w:pPr>
+            <w:r>
+              <w:t xml:space="preserve">64</w:t>
+            </w:r>
+          </w:p>
+        </w:tc>
+      </w:tr>
+      <w:tr>
+        <w:tc>
+          <w:tcPr/>
+          <w:p>
+            <w:pPr>
+              <w:pStyle w:val="Compact"/>
+              <w:jc w:val="left"/>
+            </w:pPr>
+            <w:r>
+              <w:t xml:space="preserve">Probabilidad de cruza (</w:t>
+            </w:r>
+            <m:oMath>
+              <m:sSub>
+                <m:e>
+                  <m:r>
+                    <m:t>p</m:t>
+                  </m:r>
+                </m:e>
+                <m:sub>
+                  <m:r>
+                    <m:rPr>
+                      <m:nor/>
+                      <m:sty m:val="p"/>
+                    </m:rPr>
+                    <m:t>cruza</m:t>
+                  </m:r>
+                </m:sub>
+              </m:sSub>
+            </m:oMath>
+            <w:r>
+              <w:t xml:space="preserve">)</w:t>
+            </w:r>
+          </w:p>
+        </w:tc>
+        <w:tc>
+          <w:tcPr/>
+          <w:p>
+            <w:pPr>
+              <w:pStyle w:val="Compact"/>
+              <w:jc w:val="left"/>
+            </w:pPr>
+            <w:r>
+              <w:t xml:space="preserve">0.90</w:t>
+            </w:r>
+          </w:p>
+        </w:tc>
+      </w:tr>
+      <w:tr>
+        <w:tc>
+          <w:tcPr/>
+          <w:p>
+            <w:pPr>
+              <w:pStyle w:val="Compact"/>
+              <w:jc w:val="left"/>
+            </w:pPr>
+            <w:r>
+              <w:t xml:space="preserve">Probabilidad de mutación (</w:t>
+            </w:r>
+            <m:oMath>
+              <m:sSub>
+                <m:e>
+                  <m:r>
+                    <m:t>p</m:t>
+                  </m:r>
+                </m:e>
+                <m:sub>
+                  <m:r>
+                    <m:rPr>
+                      <m:nor/>
+                      <m:sty m:val="p"/>
+                    </m:rPr>
+                    <m:t>mut</m:t>
+                  </m:r>
+                </m:sub>
+              </m:sSub>
+            </m:oMath>
+            <w:r>
+              <w:t xml:space="preserve">)</w:t>
+            </w:r>
+          </w:p>
+        </w:tc>
+        <w:tc>
+          <w:tcPr/>
+          <w:p>
+            <w:pPr>
+              <w:pStyle w:val="Compact"/>
+              <w:jc w:val="left"/>
+            </w:pPr>
+            <w:r>
+              <w:t xml:space="preserve">0.05</w:t>
+            </w:r>
+          </w:p>
+        </w:tc>
+      </w:tr>
+      <w:tr>
+        <w:tc>
+          <w:tcPr/>
+          <w:p>
+            <w:pPr>
+              <w:pStyle w:val="Compact"/>
+              <w:jc w:val="left"/>
+            </w:pPr>
+            <w:r>
+              <w:t xml:space="preserve">Penalización por complejidad (</w:t>
+            </w:r>
+            <m:oMath>
+              <m:r>
+                <m:t>λ</m:t>
+              </m:r>
+            </m:oMath>
+            <w:r>
+              <w:t xml:space="preserve">)</w:t>
+            </w:r>
+          </w:p>
+        </w:tc>
+        <w:tc>
+          <w:tcPr/>
+          <w:p>
+            <w:pPr>
+              <w:pStyle w:val="Compact"/>
+              <w:jc w:val="left"/>
+            </w:pPr>
+            <w:r>
+              <w:t xml:space="preserve">0.01</w:t>
+            </w:r>
+          </w:p>
+        </w:tc>
+      </w:tr>
+      <w:tr>
+        <w:tc>
+          <w:tcPr/>
+          <w:p>
+            <w:pPr>
+              <w:pStyle w:val="Compact"/>
+              <w:jc w:val="left"/>
+            </w:pPr>
+            <w:r>
+              <w:t xml:space="preserve">Selección</w:t>
+            </w:r>
+          </w:p>
+        </w:tc>
+        <w:tc>
+          <w:tcPr/>
+          <w:p>
+            <w:pPr>
+              <w:pStyle w:val="Compact"/>
+              <w:jc w:val="left"/>
+            </w:pPr>
+            <w:r>
+              <w:t xml:space="preserve">Torneo binario</w:t>
+            </w:r>
+          </w:p>
+        </w:tc>
+      </w:tr>
+      <w:tr>
+        <w:tc>
+          <w:tcPr/>
+          <w:p>
+            <w:pPr>
+              <w:pStyle w:val="Compact"/>
+              <w:jc w:val="left"/>
+            </w:pPr>
+            <w:r>
+              <w:t xml:space="preserve">Cruza</w:t>
+            </w:r>
+          </w:p>
+        </w:tc>
+        <w:tc>
+          <w:tcPr/>
+          <w:p>
+            <w:pPr>
+              <w:pStyle w:val="Compact"/>
+              <w:jc w:val="left"/>
+            </w:pPr>
+            <w:r>
+              <w:t xml:space="preserve">Un punto</w:t>
+            </w:r>
+          </w:p>
+        </w:tc>
+      </w:tr>
+      <w:tr>
+        <w:tc>
+          <w:tcPr/>
+          <w:p>
+            <w:pPr>
+              <w:pStyle w:val="Compact"/>
+              <w:jc w:val="left"/>
+            </w:pPr>
+            <w:r>
+              <w:t xml:space="preserve">Representación</w:t>
+            </w:r>
+          </w:p>
+        </w:tc>
+        <w:tc>
+          <w:tcPr/>
+          <w:p>
+            <w:pPr>
+              <w:pStyle w:val="Compact"/>
+              <w:jc w:val="left"/>
+            </w:pPr>
+            <w:r>
+              <w:t xml:space="preserve">Binaria</w:t>
+            </w:r>
+          </w:p>
+        </w:tc>
+      </w:tr>
+      <w:tr>
+        <w:tc>
+          <w:tcPr/>
+          <w:p>
+            <w:pPr>
+              <w:pStyle w:val="Compact"/>
+              <w:jc w:val="left"/>
+            </w:pPr>
+            <w:r>
+              <w:t xml:space="preserve">Elitismo</w:t>
+            </w:r>
+          </w:p>
+        </w:tc>
+        <w:tc>
+          <w:tcPr/>
+          <w:p>
+            <w:pPr>
+              <w:pStyle w:val="Compact"/>
+              <w:jc w:val="left"/>
+            </w:pPr>
+            <w:r>
+              <w:t xml:space="preserve">2 mejores individuos</w:t>
+            </w:r>
+          </w:p>
+        </w:tc>
+      </w:tr>
+    </w:tbl>
+    <w:p>
+      <w:pPr>
+        <w:pStyle w:val="Textoindependiente"/>
+      </w:pPr>
+      <w:r>
+        <w:t xml:space="preserve">Estos valores se emplearon tanto en la selección evolutiva de variables originales como en la selección de términos polinomiales, manteniendo constante la configuración genética a lo largo de las dos fases de GNLPDA.</w:t>
       </w:r>
     </w:p>
     <w:bookmarkEnd w:id="22"/>
-    <w:bookmarkStart w:id="25" w:name="objetivos"/>
-    <w:p>
-      <w:pPr>
-        <w:pStyle w:val="Ttulo2"/>
-      </w:pPr>
-      <w:r>
-        <w:rPr>
-          <w:rStyle w:val="SectionNumber"/>
-        </w:rPr>
-        <w:t xml:space="preserve">1.4</w:t>
-      </w:r>
-      <w:r>
-        <w:tab/>
-      </w:r>
-      <w:r>
-        <w:t xml:space="preserve">Objetivos</w:t>
-      </w:r>
-    </w:p>
-    <w:bookmarkStart w:id="23" w:name="objetivo-general"/>
-    <w:p>
-      <w:pPr>
-        <w:pStyle w:val="Ttulo3"/>
-      </w:pPr>
-      <w:r>
-        <w:rPr>
-          <w:rStyle w:val="SectionNumber"/>
-        </w:rPr>
-        <w:t xml:space="preserve">1.4.1</w:t>
-      </w:r>
-      <w:r>
-        <w:tab/>
-      </w:r>
-      <w:r>
-        <w:t xml:space="preserve">Objetivo general</w:t>
-      </w:r>
-    </w:p>
     <w:bookmarkEnd w:id="23"/>
-    <w:bookmarkStart w:id="24" w:name="objetivos-específicos"/>
-    <w:p>
-      <w:pPr>
-        <w:pStyle w:val="Ttulo3"/>
-      </w:pPr>
-      <w:r>
-        <w:rPr>
-          <w:rStyle w:val="SectionNumber"/>
-        </w:rPr>
-        <w:t xml:space="preserve">1.4.2</w:t>
-      </w:r>
-      <w:r>
-        <w:tab/>
-      </w:r>
-      <w:r>
-        <w:t xml:space="preserve">Objetivos específicos</w:t>
-      </w:r>
-    </w:p>
-    <w:bookmarkEnd w:id="24"/>
-    <w:bookmarkEnd w:id="25"/>
-    <w:bookmarkStart w:id="26" w:name="contribuciones"/>
-    <w:p>
-      <w:pPr>
-        <w:pStyle w:val="Ttulo2"/>
-      </w:pPr>
-      <w:r>
-        <w:rPr>
-          <w:rStyle w:val="SectionNumber"/>
-        </w:rPr>
-        <w:t xml:space="preserve">1.5</w:t>
-      </w:r>
-      <w:r>
-        <w:tab/>
-      </w:r>
-      <w:r>
-        <w:t xml:space="preserve">Contribuciones</w:t>
-      </w:r>
-    </w:p>
-    <w:bookmarkEnd w:id="26"/>
-    <w:bookmarkStart w:id="27" w:name="organización-de-la-tesis"/>
-    <w:p>
-      <w:pPr>
-        <w:pStyle w:val="Ttulo2"/>
-      </w:pPr>
-      <w:r>
-        <w:rPr>
-          <w:rStyle w:val="SectionNumber"/>
-        </w:rPr>
-        <w:t xml:space="preserve">1.6</w:t>
-      </w:r>
-      <w:r>
-        <w:tab/>
-      </w:r>
-      <w:r>
-        <w:t xml:space="preserve">Organización de la tesis</w:t>
-      </w:r>
-    </w:p>
-    <w:bookmarkEnd w:id="27"/>
-    <w:bookmarkEnd w:id="28"/>
-    <w:bookmarkStart w:id="88" w:name="capítulo-2.-marco-teórico"/>
-    <w:p>
-      <w:pPr>
-        <w:pStyle w:val="Ttulo1"/>
-      </w:pPr>
-      <w:r>
-        <w:rPr>
-          <w:rStyle w:val="SectionNumber"/>
-        </w:rPr>
-        <w:t xml:space="preserve">2</w:t>
-      </w:r>
-      <w:r>
-        <w:tab/>
-      </w:r>
-      <w:r>
-        <w:t xml:space="preserve">Capítulo 2. Marco Teórico</w:t>
-      </w:r>
-    </w:p>
-    <w:bookmarkStart w:id="35" w:name="reducción-de-dimensionalidad"/>
-    <w:p>
-      <w:pPr>
-        <w:pStyle w:val="Ttulo2"/>
-      </w:pPr>
-      <w:r>
-        <w:rPr>
-          <w:rStyle w:val="SectionNumber"/>
-        </w:rPr>
-        <w:t xml:space="preserve">2.1</w:t>
-      </w:r>
-      <w:r>
-        <w:tab/>
-      </w:r>
-      <w:r>
-        <w:t xml:space="preserve">Reducción de dimensionalidad</w:t>
-      </w:r>
-    </w:p>
-    <w:bookmarkStart w:id="29" w:name="X5b0b94ce91b7711d5de47d4c491bb7895984cab"/>
-    <w:p>
-      <w:pPr>
-        <w:pStyle w:val="Ttulo3"/>
-      </w:pPr>
-      <w:r>
-        <w:rPr>
-          <w:rStyle w:val="SectionNumber"/>
-        </w:rPr>
-        <w:t xml:space="preserve">2.1.1</w:t>
-      </w:r>
-      <w:r>
-        <w:tab/>
-      </w:r>
-      <w:r>
-        <w:t xml:space="preserve">Fundamentos y necesidad de la reducción de dimensionalidad</w:t>
-      </w:r>
-    </w:p>
-    <w:bookmarkEnd w:id="29"/>
-    <w:bookmarkStart w:id="30" w:name="selección-de-características"/>
-    <w:p>
-      <w:pPr>
-        <w:pStyle w:val="Ttulo3"/>
-      </w:pPr>
-      <w:r>
-        <w:rPr>
-          <w:rStyle w:val="SectionNumber"/>
-        </w:rPr>
-        <w:t xml:space="preserve">2.1.2</w:t>
-      </w:r>
-      <w:r>
-        <w:tab/>
-      </w:r>
-      <w:r>
-        <w:t xml:space="preserve">Selección de características</w:t>
-      </w:r>
-    </w:p>
-    <w:bookmarkEnd w:id="30"/>
-    <w:bookmarkStart w:id="31" w:name="extracción-de-características"/>
-    <w:p>
-      <w:pPr>
-        <w:pStyle w:val="Ttulo3"/>
-      </w:pPr>
-      <w:r>
-        <w:rPr>
-          <w:rStyle w:val="SectionNumber"/>
-        </w:rPr>
-        <w:t xml:space="preserve">2.1.3</w:t>
-      </w:r>
-      <w:r>
-        <w:tab/>
-      </w:r>
-      <w:r>
-        <w:t xml:space="preserve">Extracción de características</w:t>
-      </w:r>
-    </w:p>
-    <w:bookmarkEnd w:id="31"/>
-    <w:bookmarkStart w:id="32" w:name="métodos-filtro"/>
-    <w:p>
-      <w:pPr>
-        <w:pStyle w:val="Ttulo3"/>
-      </w:pPr>
-      <w:r>
-        <w:rPr>
-          <w:rStyle w:val="SectionNumber"/>
-        </w:rPr>
-        <w:t xml:space="preserve">2.1.4</w:t>
-      </w:r>
-      <w:r>
-        <w:tab/>
-      </w:r>
-      <w:r>
-        <w:t xml:space="preserve">Métodos filtro</w:t>
-      </w:r>
-    </w:p>
-    <w:bookmarkEnd w:id="32"/>
-    <w:bookmarkStart w:id="33" w:name="métodos-wrapper"/>
-    <w:p>
-      <w:pPr>
-        <w:pStyle w:val="Ttulo3"/>
-      </w:pPr>
-      <w:r>
-        <w:rPr>
-          <w:rStyle w:val="SectionNumber"/>
-        </w:rPr>
-        <w:t xml:space="preserve">2.1.5</w:t>
-      </w:r>
-      <w:r>
-        <w:tab/>
-      </w:r>
-      <w:r>
-        <w:t xml:space="preserve">Métodos wrapper</w:t>
-      </w:r>
-    </w:p>
-    <w:bookmarkEnd w:id="33"/>
-    <w:bookmarkStart w:id="34" w:name="métodos-embedded"/>
-    <w:p>
-      <w:pPr>
-        <w:pStyle w:val="Ttulo3"/>
-      </w:pPr>
-      <w:r>
-        <w:rPr>
-          <w:rStyle w:val="SectionNumber"/>
-        </w:rPr>
-        <w:t xml:space="preserve">2.1.6</w:t>
-      </w:r>
-      <w:r>
-        <w:tab/>
-      </w:r>
-      <w:r>
-        <w:t xml:space="preserve">Métodos embedded</w:t>
-      </w:r>
-    </w:p>
-    <w:bookmarkEnd w:id="34"/>
-    <w:bookmarkEnd w:id="35"/>
-    <w:bookmarkStart w:id="49" w:name="análisis-discriminante"/>
-    <w:p>
-      <w:pPr>
-        <w:pStyle w:val="Ttulo2"/>
-      </w:pPr>
-      <w:r>
-        <w:rPr>
-          <w:rStyle w:val="SectionNumber"/>
-        </w:rPr>
-        <w:t xml:space="preserve">2.2</w:t>
-      </w:r>
-      <w:r>
-        <w:tab/>
-      </w:r>
-      <w:r>
-        <w:t xml:space="preserve">Análisis Discriminante</w:t>
-      </w:r>
-    </w:p>
-    <w:bookmarkStart w:id="36" w:name="fundamentos"/>
-    <w:p>
-      <w:pPr>
-        <w:pStyle w:val="Ttulo3"/>
-      </w:pPr>
-      <w:r>
-        <w:rPr>
-          <w:rStyle w:val="SectionNumber"/>
-        </w:rPr>
-        <w:t xml:space="preserve">2.2.1</w:t>
-      </w:r>
-      <w:r>
-        <w:tab/>
-      </w:r>
-      <w:r>
-        <w:t xml:space="preserve">Fundamentos</w:t>
-      </w:r>
-    </w:p>
-    <w:bookmarkEnd w:id="36"/>
-    <w:bookmarkStart w:id="37" w:name="lda-para-dos-clases"/>
-    <w:p>
-      <w:pPr>
-        <w:pStyle w:val="Ttulo3"/>
-      </w:pPr>
-      <w:r>
-        <w:rPr>
-          <w:rStyle w:val="SectionNumber"/>
-        </w:rPr>
-        <w:t xml:space="preserve">2.2.2</w:t>
-      </w:r>
-      <w:r>
-        <w:tab/>
-      </w:r>
-      <w:r>
-        <w:t xml:space="preserve">LDA para dos clases</w:t>
-      </w:r>
-    </w:p>
-    <w:bookmarkEnd w:id="37"/>
-    <w:bookmarkStart w:id="38" w:name="lda-multiclase"/>
-    <w:p>
-      <w:pPr>
-        <w:pStyle w:val="Ttulo3"/>
-      </w:pPr>
-      <w:r>
-        <w:rPr>
-          <w:rStyle w:val="SectionNumber"/>
-        </w:rPr>
-        <w:t xml:space="preserve">2.2.3</w:t>
-      </w:r>
-      <w:r>
-        <w:tab/>
-      </w:r>
-      <w:r>
-        <w:t xml:space="preserve">LDA multiclase</w:t>
-      </w:r>
-    </w:p>
-    <w:bookmarkEnd w:id="38"/>
-    <w:bookmarkStart w:id="39" w:name="matriz-de-dispersión-intra-clase"/>
-    <w:p>
-      <w:pPr>
-        <w:pStyle w:val="Ttulo3"/>
-      </w:pPr>
-      <w:r>
-        <w:rPr>
-          <w:rStyle w:val="SectionNumber"/>
-        </w:rPr>
-        <w:t xml:space="preserve">2.2.4</w:t>
-      </w:r>
-      <w:r>
-        <w:tab/>
-      </w:r>
-      <w:r>
-        <w:t xml:space="preserve">Matriz de dispersión intra-clase</w:t>
-      </w:r>
-    </w:p>
-    <w:bookmarkEnd w:id="39"/>
-    <w:bookmarkStart w:id="40" w:name="matriz-de-dispersión-inter-clase"/>
-    <w:p>
-      <w:pPr>
-        <w:pStyle w:val="Ttulo3"/>
-      </w:pPr>
-      <w:r>
-        <w:rPr>
-          <w:rStyle w:val="SectionNumber"/>
-        </w:rPr>
-        <w:t xml:space="preserve">2.2.5</w:t>
-      </w:r>
-      <w:r>
-        <w:tab/>
-      </w:r>
-      <w:r>
-        <w:t xml:space="preserve">Matriz de dispersión inter-clase</w:t>
-      </w:r>
-    </w:p>
-    <w:bookmarkEnd w:id="40"/>
-    <w:bookmarkStart w:id="41" w:name="criterio-de-fisher"/>
-    <w:p>
-      <w:pPr>
-        <w:pStyle w:val="Ttulo3"/>
-      </w:pPr>
-      <w:r>
-        <w:rPr>
-          <w:rStyle w:val="SectionNumber"/>
-        </w:rPr>
-        <w:t xml:space="preserve">2.2.6</w:t>
-      </w:r>
-      <w:r>
-        <w:tab/>
-      </w:r>
-      <w:r>
-        <w:t xml:space="preserve">Criterio de Fisher</w:t>
-      </w:r>
-    </w:p>
-    <w:bookmarkEnd w:id="41"/>
-    <w:bookmarkStart w:id="42" w:name="obtención-de-vectores-discriminantes"/>
-    <w:p>
-      <w:pPr>
-        <w:pStyle w:val="Ttulo3"/>
-      </w:pPr>
-      <w:r>
-        <w:rPr>
-          <w:rStyle w:val="SectionNumber"/>
-        </w:rPr>
-        <w:t xml:space="preserve">2.2.7</w:t>
-      </w:r>
-      <w:r>
-        <w:tab/>
-      </w:r>
-      <w:r>
-        <w:t xml:space="preserve">Obtención de vectores discriminantes</w:t>
-      </w:r>
-    </w:p>
-    <w:bookmarkEnd w:id="42"/>
-    <w:bookmarkStart w:id="43" w:name="clasificación-mediante-lda"/>
-    <w:p>
-      <w:pPr>
-        <w:pStyle w:val="Ttulo3"/>
-      </w:pPr>
-      <w:r>
-        <w:rPr>
-          <w:rStyle w:val="SectionNumber"/>
-        </w:rPr>
-        <w:t xml:space="preserve">2.2.8</w:t>
-      </w:r>
-      <w:r>
-        <w:tab/>
-      </w:r>
-      <w:r>
-        <w:t xml:space="preserve">Clasificación mediante LDA</w:t>
-      </w:r>
-    </w:p>
-    <w:bookmarkEnd w:id="43"/>
-    <w:bookmarkStart w:id="44" w:name="supuestos-estadísticos"/>
-    <w:p>
-      <w:pPr>
-        <w:pStyle w:val="Ttulo3"/>
-      </w:pPr>
-      <w:r>
-        <w:rPr>
-          <w:rStyle w:val="SectionNumber"/>
-        </w:rPr>
-        <w:t xml:space="preserve">2.2.9</w:t>
-      </w:r>
-      <w:r>
-        <w:tab/>
-      </w:r>
-      <w:r>
-        <w:t xml:space="preserve">Supuestos estadísticos</w:t>
-      </w:r>
-    </w:p>
-    <w:bookmarkEnd w:id="44"/>
-    <w:bookmarkStart w:id="45" w:name="limitaciones-de-lda"/>
-    <w:p>
-      <w:pPr>
-        <w:pStyle w:val="Ttulo3"/>
-      </w:pPr>
-      <w:r>
-        <w:rPr>
-          <w:rStyle w:val="SectionNumber"/>
-        </w:rPr>
-        <w:t xml:space="preserve">2.2.10</w:t>
-      </w:r>
-      <w:r>
-        <w:tab/>
-      </w:r>
-      <w:r>
-        <w:t xml:space="preserve">Limitaciones de LDA</w:t>
-      </w:r>
-    </w:p>
-    <w:bookmarkEnd w:id="45"/>
-    <w:bookmarkStart w:id="46" w:name="variantes-computacionales-de-lda"/>
-    <w:p>
-      <w:pPr>
-        <w:pStyle w:val="Ttulo3"/>
-      </w:pPr>
-      <w:r>
-        <w:rPr>
-          <w:rStyle w:val="SectionNumber"/>
-        </w:rPr>
-        <w:t xml:space="preserve">2.2.11</w:t>
-      </w:r>
-      <w:r>
-        <w:tab/>
-      </w:r>
-      <w:r>
-        <w:t xml:space="preserve">Variantes computacionales de LDA</w:t>
-      </w:r>
-    </w:p>
-    <w:bookmarkEnd w:id="46"/>
-    <w:bookmarkStart w:id="47" w:name="análisis-discriminante-cuadrático-qda"/>
-    <w:p>
-      <w:pPr>
-        <w:pStyle w:val="Ttulo3"/>
-      </w:pPr>
-      <w:r>
-        <w:rPr>
-          <w:rStyle w:val="SectionNumber"/>
-        </w:rPr>
-        <w:t xml:space="preserve">2.2.12</w:t>
-      </w:r>
-      <w:r>
-        <w:tab/>
-      </w:r>
-      <w:r>
-        <w:t xml:space="preserve">Análisis Discriminante Cuadrático (QDA)</w:t>
-      </w:r>
-    </w:p>
-    <w:bookmarkEnd w:id="47"/>
-    <w:bookmarkStart w:id="48" w:name="comparación-entre-lda-y-qda"/>
-    <w:p>
-      <w:pPr>
-        <w:pStyle w:val="Ttulo3"/>
-      </w:pPr>
-      <w:r>
-        <w:rPr>
-          <w:rStyle w:val="SectionNumber"/>
-        </w:rPr>
-        <w:t xml:space="preserve">2.2.13</w:t>
-      </w:r>
-      <w:r>
-        <w:tab/>
-      </w:r>
-      <w:r>
-        <w:t xml:space="preserve">Comparación entre LDA y QDA</w:t>
-      </w:r>
-    </w:p>
-    <w:bookmarkEnd w:id="48"/>
-    <w:bookmarkEnd w:id="49"/>
-    <w:bookmarkStart w:id="54" w:name="problema-small-sample-size"/>
-    <w:p>
-      <w:pPr>
-        <w:pStyle w:val="Ttulo2"/>
-      </w:pPr>
-      <w:r>
-        <w:rPr>
-          <w:rStyle w:val="SectionNumber"/>
-        </w:rPr>
-        <w:t xml:space="preserve">2.3</w:t>
-      </w:r>
-      <w:r>
-        <w:tab/>
-      </w:r>
-      <w:r>
-        <w:t xml:space="preserve">Problema Small Sample Size</w:t>
-      </w:r>
-    </w:p>
-    <w:bookmarkStart w:id="50" w:name="definición-formal"/>
-    <w:p>
-      <w:pPr>
-        <w:pStyle w:val="Ttulo3"/>
-      </w:pPr>
-      <w:r>
-        <w:rPr>
-          <w:rStyle w:val="SectionNumber"/>
-        </w:rPr>
-        <w:t xml:space="preserve">2.3.1</w:t>
-      </w:r>
-      <w:r>
-        <w:tab/>
-      </w:r>
-      <w:r>
-        <w:t xml:space="preserve">Definición formal</w:t>
-      </w:r>
-    </w:p>
-    <w:bookmarkEnd w:id="50"/>
-    <w:bookmarkStart w:id="51" w:name="singularidad-de-sw"/>
-    <w:p>
-      <w:pPr>
-        <w:pStyle w:val="Ttulo3"/>
-      </w:pPr>
-      <w:r>
-        <w:rPr>
-          <w:rStyle w:val="SectionNumber"/>
-        </w:rPr>
-        <w:t xml:space="preserve">2.3.2</w:t>
-      </w:r>
-      <w:r>
-        <w:tab/>
-      </w:r>
-      <w:r>
-        <w:t xml:space="preserve">Singularidad de Sw</w:t>
-      </w:r>
-    </w:p>
-    <w:bookmarkEnd w:id="51"/>
-    <w:bookmarkStart w:id="52" w:name="impacto-en-lda"/>
-    <w:p>
-      <w:pPr>
-        <w:pStyle w:val="Ttulo3"/>
-      </w:pPr>
-      <w:r>
-        <w:rPr>
-          <w:rStyle w:val="SectionNumber"/>
-        </w:rPr>
-        <w:t xml:space="preserve">2.3.3</w:t>
-      </w:r>
-      <w:r>
-        <w:tab/>
-      </w:r>
-      <w:r>
-        <w:t xml:space="preserve">Impacto en LDA</w:t>
-      </w:r>
-    </w:p>
-    <w:bookmarkEnd w:id="52"/>
-    <w:bookmarkStart w:id="53" w:name="estrategias-para-mitigarlo"/>
-    <w:p>
-      <w:pPr>
-        <w:pStyle w:val="Ttulo3"/>
-      </w:pPr>
-      <w:r>
-        <w:rPr>
-          <w:rStyle w:val="SectionNumber"/>
-        </w:rPr>
-        <w:t xml:space="preserve">2.3.4</w:t>
-      </w:r>
-      <w:r>
-        <w:tab/>
-      </w:r>
-      <w:r>
-        <w:t xml:space="preserve">Estrategias para mitigarlo</w:t>
-      </w:r>
-    </w:p>
-    <w:bookmarkEnd w:id="53"/>
-    <w:bookmarkEnd w:id="54"/>
-    <w:bookmarkStart w:id="60" w:name="expansión-polinomial"/>
-    <w:p>
-      <w:pPr>
-        <w:pStyle w:val="Ttulo2"/>
-      </w:pPr>
-      <w:r>
-        <w:rPr>
-          <w:rStyle w:val="SectionNumber"/>
-        </w:rPr>
-        <w:t xml:space="preserve">2.4</w:t>
-      </w:r>
-      <w:r>
-        <w:tab/>
-      </w:r>
-      <w:r>
-        <w:t xml:space="preserve">Expansión polinomial</w:t>
-      </w:r>
-    </w:p>
-    <w:bookmarkStart w:id="55" w:name="espacios-de-características"/>
-    <w:p>
-      <w:pPr>
-        <w:pStyle w:val="Ttulo3"/>
-      </w:pPr>
-      <w:r>
-        <w:rPr>
-          <w:rStyle w:val="SectionNumber"/>
-        </w:rPr>
-        <w:t xml:space="preserve">2.4.1</w:t>
-      </w:r>
-      <w:r>
-        <w:tab/>
-      </w:r>
-      <w:r>
-        <w:t xml:space="preserve">Espacios de características</w:t>
-      </w:r>
-    </w:p>
-    <w:bookmarkEnd w:id="55"/>
-    <w:bookmarkStart w:id="56" w:name="teorema-de-cover"/>
-    <w:p>
-      <w:pPr>
-        <w:pStyle w:val="Ttulo3"/>
-      </w:pPr>
-      <w:r>
-        <w:rPr>
-          <w:rStyle w:val="SectionNumber"/>
-        </w:rPr>
-        <w:t xml:space="preserve">2.4.2</w:t>
-      </w:r>
-      <w:r>
-        <w:tab/>
-      </w:r>
-      <w:r>
-        <w:t xml:space="preserve">Teorema de Cover</w:t>
-      </w:r>
-    </w:p>
-    <w:bookmarkEnd w:id="56"/>
-    <w:bookmarkStart w:id="57" w:name="expansión-polinomial-explícita"/>
-    <w:p>
-      <w:pPr>
-        <w:pStyle w:val="Ttulo3"/>
-      </w:pPr>
-      <w:r>
-        <w:rPr>
-          <w:rStyle w:val="SectionNumber"/>
-        </w:rPr>
-        <w:t xml:space="preserve">2.4.3</w:t>
-      </w:r>
-      <w:r>
-        <w:tab/>
-      </w:r>
-      <w:r>
-        <w:t xml:space="preserve">Expansión polinomial explícita</w:t>
-      </w:r>
-    </w:p>
-    <w:bookmarkEnd w:id="57"/>
-    <w:bookmarkStart w:id="58" w:name="crecimiento-combinatorial"/>
-    <w:p>
-      <w:pPr>
-        <w:pStyle w:val="Ttulo3"/>
-      </w:pPr>
-      <w:r>
-        <w:rPr>
-          <w:rStyle w:val="SectionNumber"/>
-        </w:rPr>
-        <w:t xml:space="preserve">2.4.4</w:t>
-      </w:r>
-      <w:r>
-        <w:tab/>
-      </w:r>
-      <w:r>
-        <w:t xml:space="preserve">Crecimiento combinatorial</w:t>
-      </w:r>
-    </w:p>
-    <w:bookmarkEnd w:id="58"/>
-    <w:bookmarkStart w:id="59" w:name="relación-con-sss"/>
-    <w:p>
-      <w:pPr>
-        <w:pStyle w:val="Ttulo3"/>
-      </w:pPr>
-      <w:r>
-        <w:rPr>
-          <w:rStyle w:val="SectionNumber"/>
-        </w:rPr>
-        <w:t xml:space="preserve">2.4.5</w:t>
-      </w:r>
-      <w:r>
-        <w:tab/>
-      </w:r>
-      <w:r>
-        <w:t xml:space="preserve">Relación con SSS</w:t>
-      </w:r>
-    </w:p>
-    <w:bookmarkEnd w:id="59"/>
-    <w:bookmarkEnd w:id="60"/>
-    <w:bookmarkStart w:id="68" w:name="algoritmos-genéticos"/>
-    <w:p>
-      <w:pPr>
-        <w:pStyle w:val="Ttulo2"/>
-      </w:pPr>
-      <w:r>
-        <w:rPr>
-          <w:rStyle w:val="SectionNumber"/>
-        </w:rPr>
-        <w:t xml:space="preserve">2.5</w:t>
-      </w:r>
-      <w:r>
-        <w:tab/>
-      </w:r>
-      <w:r>
-        <w:t xml:space="preserve">Algoritmos genéticos</w:t>
-      </w:r>
-    </w:p>
-    <w:bookmarkStart w:id="61" w:name="inspiración-biológica"/>
-    <w:p>
-      <w:pPr>
-        <w:pStyle w:val="Ttulo3"/>
-      </w:pPr>
-      <w:r>
-        <w:rPr>
-          <w:rStyle w:val="SectionNumber"/>
-        </w:rPr>
-        <w:t xml:space="preserve">2.5.1</w:t>
-      </w:r>
-      <w:r>
-        <w:tab/>
-      </w:r>
-      <w:r>
-        <w:t xml:space="preserve">Inspiración biológica</w:t>
-      </w:r>
-    </w:p>
-    <w:bookmarkEnd w:id="61"/>
-    <w:bookmarkStart w:id="62" w:name="representación-cromosómica"/>
-    <w:p>
-      <w:pPr>
-        <w:pStyle w:val="Ttulo3"/>
-      </w:pPr>
-      <w:r>
-        <w:rPr>
-          <w:rStyle w:val="SectionNumber"/>
-        </w:rPr>
-        <w:t xml:space="preserve">2.5.2</w:t>
-      </w:r>
-      <w:r>
-        <w:tab/>
-      </w:r>
-      <w:r>
-        <w:t xml:space="preserve">Representación cromosómica</w:t>
-      </w:r>
-    </w:p>
-    <w:bookmarkEnd w:id="62"/>
-    <w:bookmarkStart w:id="63" w:name="función-fitness"/>
-    <w:p>
-      <w:pPr>
-        <w:pStyle w:val="Ttulo3"/>
-      </w:pPr>
-      <w:r>
-        <w:rPr>
-          <w:rStyle w:val="SectionNumber"/>
-        </w:rPr>
-        <w:t xml:space="preserve">2.5.3</w:t>
-      </w:r>
-      <w:r>
-        <w:tab/>
-      </w:r>
-      <w:r>
-        <w:t xml:space="preserve">Función fitness</w:t>
-      </w:r>
-    </w:p>
-    <w:bookmarkEnd w:id="63"/>
-    <w:bookmarkStart w:id="64" w:name="selección"/>
-    <w:p>
-      <w:pPr>
-        <w:pStyle w:val="Ttulo3"/>
-      </w:pPr>
-      <w:r>
-        <w:rPr>
-          <w:rStyle w:val="SectionNumber"/>
-        </w:rPr>
-        <w:t xml:space="preserve">2.5.4</w:t>
-      </w:r>
-      <w:r>
-        <w:tab/>
-      </w:r>
-      <w:r>
-        <w:t xml:space="preserve">Selección</w:t>
-      </w:r>
-    </w:p>
-    <w:bookmarkEnd w:id="64"/>
-    <w:bookmarkStart w:id="65" w:name="cruza"/>
-    <w:p>
-      <w:pPr>
-        <w:pStyle w:val="Ttulo3"/>
-      </w:pPr>
-      <w:r>
-        <w:rPr>
-          <w:rStyle w:val="SectionNumber"/>
-        </w:rPr>
-        <w:t xml:space="preserve">2.5.5</w:t>
-      </w:r>
-      <w:r>
-        <w:tab/>
-      </w:r>
-      <w:r>
-        <w:t xml:space="preserve">Cruza</w:t>
-      </w:r>
-    </w:p>
-    <w:bookmarkEnd w:id="65"/>
-    <w:bookmarkStart w:id="66" w:name="mutación"/>
-    <w:p>
-      <w:pPr>
-        <w:pStyle w:val="Ttulo3"/>
-      </w:pPr>
-      <w:r>
-        <w:rPr>
-          <w:rStyle w:val="SectionNumber"/>
-        </w:rPr>
-        <w:t xml:space="preserve">2.5.6</w:t>
-      </w:r>
-      <w:r>
-        <w:tab/>
-      </w:r>
-      <w:r>
-        <w:t xml:space="preserve">Mutación</w:t>
-      </w:r>
-    </w:p>
-    <w:bookmarkEnd w:id="66"/>
-    <w:bookmarkStart w:id="67" w:name="X8605880a15ae821f06f56069101978b8eac3be4"/>
-    <w:p>
-      <w:pPr>
-        <w:pStyle w:val="Ttulo3"/>
-      </w:pPr>
-      <w:r>
-        <w:rPr>
-          <w:rStyle w:val="SectionNumber"/>
-        </w:rPr>
-        <w:t xml:space="preserve">2.5.7</w:t>
-      </w:r>
-      <w:r>
-        <w:tab/>
-      </w:r>
-      <w:r>
-        <w:t xml:space="preserve">Aplicaciones en selección de características</w:t>
-      </w:r>
-    </w:p>
-    <w:bookmarkEnd w:id="67"/>
-    <w:bookmarkEnd w:id="68"/>
-    <w:bookmarkStart w:id="76" w:name="métodos-kernel"/>
-    <w:p>
-      <w:pPr>
-        <w:pStyle w:val="Ttulo2"/>
-      </w:pPr>
-      <w:r>
-        <w:rPr>
-          <w:rStyle w:val="SectionNumber"/>
-        </w:rPr>
-        <w:t xml:space="preserve">2.6</w:t>
-      </w:r>
-      <w:r>
-        <w:tab/>
-      </w:r>
-      <w:r>
-        <w:t xml:space="preserve">Métodos kernel</w:t>
-      </w:r>
-    </w:p>
-    <w:bookmarkStart w:id="69" w:name="fundamentos-1"/>
-    <w:p>
-      <w:pPr>
-        <w:pStyle w:val="Ttulo3"/>
-      </w:pPr>
-      <w:r>
-        <w:rPr>
-          <w:rStyle w:val="SectionNumber"/>
-        </w:rPr>
-        <w:t xml:space="preserve">2.6.1</w:t>
-      </w:r>
-      <w:r>
-        <w:tab/>
-      </w:r>
-      <w:r>
-        <w:t xml:space="preserve">Fundamentos</w:t>
-      </w:r>
-    </w:p>
-    <w:bookmarkEnd w:id="69"/>
-    <w:bookmarkStart w:id="70" w:name="kernel-trick"/>
-    <w:p>
-      <w:pPr>
-        <w:pStyle w:val="Ttulo3"/>
-      </w:pPr>
-      <w:r>
-        <w:rPr>
-          <w:rStyle w:val="SectionNumber"/>
-        </w:rPr>
-        <w:t xml:space="preserve">2.6.2</w:t>
-      </w:r>
-      <w:r>
-        <w:tab/>
-      </w:r>
-      <w:r>
-        <w:t xml:space="preserve">Kernel Trick</w:t>
-      </w:r>
-    </w:p>
-    <w:bookmarkEnd w:id="70"/>
-    <w:bookmarkStart w:id="73" w:name="funciones-kernel"/>
-    <w:p>
-      <w:pPr>
-        <w:pStyle w:val="Ttulo3"/>
-      </w:pPr>
-      <w:r>
-        <w:rPr>
-          <w:rStyle w:val="SectionNumber"/>
-        </w:rPr>
-        <w:t xml:space="preserve">2.6.3</w:t>
-      </w:r>
-      <w:r>
-        <w:tab/>
-      </w:r>
-      <w:r>
-        <w:t xml:space="preserve">Funciones kernel</w:t>
-      </w:r>
-    </w:p>
-    <w:bookmarkStart w:id="71" w:name="polinomial"/>
-    <w:p>
-      <w:pPr>
-        <w:pStyle w:val="Ttulo4"/>
-      </w:pPr>
-      <w:r>
-        <w:rPr>
-          <w:rStyle w:val="SectionNumber"/>
-        </w:rPr>
-        <w:t xml:space="preserve">2.6.3.1</w:t>
-      </w:r>
-      <w:r>
-        <w:tab/>
-      </w:r>
-      <w:r>
-        <w:t xml:space="preserve">Polinomial</w:t>
-      </w:r>
-    </w:p>
-    <w:bookmarkEnd w:id="71"/>
-    <w:bookmarkStart w:id="72" w:name="gaussiano"/>
-    <w:p>
-      <w:pPr>
-        <w:pStyle w:val="Ttulo4"/>
-      </w:pPr>
-      <w:r>
-        <w:rPr>
-          <w:rStyle w:val="SectionNumber"/>
-        </w:rPr>
-        <w:t xml:space="preserve">2.6.3.2</w:t>
-      </w:r>
-      <w:r>
-        <w:tab/>
-      </w:r>
-      <w:r>
-        <w:t xml:space="preserve">Gaussiano</w:t>
-      </w:r>
-    </w:p>
-    <w:bookmarkEnd w:id="72"/>
-    <w:bookmarkEnd w:id="73"/>
-    <w:bookmarkStart w:id="74" w:name="kfda"/>
-    <w:p>
-      <w:pPr>
-        <w:pStyle w:val="Ttulo3"/>
-      </w:pPr>
-      <w:r>
-        <w:rPr>
-          <w:rStyle w:val="SectionNumber"/>
-        </w:rPr>
-        <w:t xml:space="preserve">2.6.4</w:t>
-      </w:r>
-      <w:r>
-        <w:tab/>
-      </w:r>
-      <w:r>
-        <w:t xml:space="preserve">KFDA</w:t>
-      </w:r>
-    </w:p>
-    <w:bookmarkEnd w:id="74"/>
-    <w:bookmarkStart w:id="75" w:name="ventajas-y-limitaciones"/>
-    <w:p>
-      <w:pPr>
-        <w:pStyle w:val="Ttulo3"/>
-      </w:pPr>
-      <w:r>
-        <w:rPr>
-          <w:rStyle w:val="SectionNumber"/>
-        </w:rPr>
-        <w:t xml:space="preserve">2.6.5</w:t>
-      </w:r>
-      <w:r>
-        <w:tab/>
-      </w:r>
-      <w:r>
-        <w:t xml:space="preserve">Ventajas y limitaciones</w:t>
-      </w:r>
-    </w:p>
-    <w:bookmarkEnd w:id="75"/>
-    <w:bookmarkEnd w:id="76"/>
-    <w:bookmarkStart w:id="81" w:name="máquinas-de-soporte-vectorial"/>
-    <w:p>
-      <w:pPr>
-        <w:pStyle w:val="Ttulo2"/>
-      </w:pPr>
-      <w:r>
-        <w:rPr>
-          <w:rStyle w:val="SectionNumber"/>
-        </w:rPr>
-        <w:t xml:space="preserve">2.7</w:t>
-      </w:r>
-      <w:r>
-        <w:tab/>
-      </w:r>
-      <w:r>
-        <w:t xml:space="preserve">Máquinas de Soporte Vectorial</w:t>
-      </w:r>
-    </w:p>
-    <w:bookmarkStart w:id="77" w:name="fundamentos-2"/>
-    <w:p>
-      <w:pPr>
-        <w:pStyle w:val="Ttulo3"/>
-      </w:pPr>
-      <w:r>
-        <w:rPr>
-          <w:rStyle w:val="SectionNumber"/>
-        </w:rPr>
-        <w:t xml:space="preserve">2.7.1</w:t>
-      </w:r>
-      <w:r>
-        <w:tab/>
-      </w:r>
-      <w:r>
-        <w:t xml:space="preserve">Fundamentos</w:t>
-      </w:r>
-    </w:p>
-    <w:bookmarkEnd w:id="77"/>
-    <w:bookmarkStart w:id="78" w:name="margen-máximo"/>
-    <w:p>
-      <w:pPr>
-        <w:pStyle w:val="Ttulo3"/>
-      </w:pPr>
-      <w:r>
-        <w:rPr>
-          <w:rStyle w:val="SectionNumber"/>
-        </w:rPr>
-        <w:t xml:space="preserve">2.7.2</w:t>
-      </w:r>
-      <w:r>
-        <w:tab/>
-      </w:r>
-      <w:r>
-        <w:t xml:space="preserve">Margen máximo</w:t>
-      </w:r>
-    </w:p>
-    <w:bookmarkEnd w:id="78"/>
-    <w:bookmarkStart w:id="79" w:name="svm-polinomial"/>
-    <w:p>
-      <w:pPr>
-        <w:pStyle w:val="Ttulo3"/>
-      </w:pPr>
-      <w:r>
-        <w:rPr>
-          <w:rStyle w:val="SectionNumber"/>
-        </w:rPr>
-        <w:t xml:space="preserve">2.7.3</w:t>
-      </w:r>
-      <w:r>
-        <w:tab/>
-      </w:r>
-      <w:r>
-        <w:t xml:space="preserve">SVM polinomial</w:t>
-      </w:r>
-    </w:p>
-    <w:bookmarkEnd w:id="79"/>
-    <w:bookmarkStart w:id="80" w:name="svm-rbf"/>
-    <w:p>
-      <w:pPr>
-        <w:pStyle w:val="Ttulo3"/>
-      </w:pPr>
-      <w:r>
-        <w:rPr>
-          <w:rStyle w:val="SectionNumber"/>
-        </w:rPr>
-        <w:t xml:space="preserve">2.7.4</w:t>
-      </w:r>
-      <w:r>
-        <w:tab/>
-      </w:r>
-      <w:r>
-        <w:t xml:space="preserve">SVM RBF</w:t>
-      </w:r>
-    </w:p>
-    <w:bookmarkEnd w:id="80"/>
-    <w:bookmarkEnd w:id="81"/>
-    <w:bookmarkStart w:id="87" w:name="métricas-de-clasificación"/>
-    <w:p>
-      <w:pPr>
-        <w:pStyle w:val="Ttulo2"/>
-      </w:pPr>
-      <w:r>
-        <w:rPr>
-          <w:rStyle w:val="SectionNumber"/>
-        </w:rPr>
-        <w:t xml:space="preserve">2.8</w:t>
-      </w:r>
-      <w:r>
-        <w:tab/>
-      </w:r>
-      <w:r>
-        <w:t xml:space="preserve">Métricas de clasificación</w:t>
-      </w:r>
-    </w:p>
-    <w:bookmarkStart w:id="82" w:name="matriz-de-confusión"/>
-    <w:p>
-      <w:pPr>
-        <w:pStyle w:val="Ttulo3"/>
-      </w:pPr>
-      <w:r>
-        <w:rPr>
-          <w:rStyle w:val="SectionNumber"/>
-        </w:rPr>
-        <w:t xml:space="preserve">2.8.1</w:t>
-      </w:r>
-      <w:r>
-        <w:tab/>
-      </w:r>
-      <w:r>
-        <w:t xml:space="preserve">Matriz de confusión</w:t>
-      </w:r>
-    </w:p>
-    <w:bookmarkEnd w:id="82"/>
-    <w:bookmarkStart w:id="83" w:name="accuracy"/>
-    <w:p>
-      <w:pPr>
-        <w:pStyle w:val="Ttulo3"/>
-      </w:pPr>
-      <w:r>
-        <w:rPr>
-          <w:rStyle w:val="SectionNumber"/>
-        </w:rPr>
-        <w:t xml:space="preserve">2.8.2</w:t>
-      </w:r>
-      <w:r>
-        <w:tab/>
-      </w:r>
-      <w:r>
-        <w:t xml:space="preserve">Accuracy</w:t>
-      </w:r>
-    </w:p>
-    <w:bookmarkEnd w:id="83"/>
-    <w:bookmarkStart w:id="84" w:name="precision"/>
-    <w:p>
-      <w:pPr>
-        <w:pStyle w:val="Ttulo3"/>
-      </w:pPr>
-      <w:r>
-        <w:rPr>
-          <w:rStyle w:val="SectionNumber"/>
-        </w:rPr>
-        <w:t xml:space="preserve">2.8.3</w:t>
-      </w:r>
-      <w:r>
-        <w:tab/>
-      </w:r>
-      <w:r>
-        <w:t xml:space="preserve">Precision</w:t>
-      </w:r>
-    </w:p>
-    <w:bookmarkEnd w:id="84"/>
-    <w:bookmarkStart w:id="85" w:name="recall"/>
-    <w:p>
-      <w:pPr>
-        <w:pStyle w:val="Ttulo3"/>
-      </w:pPr>
-      <w:r>
-        <w:rPr>
-          <w:rStyle w:val="SectionNumber"/>
-        </w:rPr>
-        <w:t xml:space="preserve">2.8.4</w:t>
-      </w:r>
-      <w:r>
-        <w:tab/>
-      </w:r>
-      <w:r>
-        <w:t xml:space="preserve">Recall</w:t>
-      </w:r>
-    </w:p>
-    <w:bookmarkEnd w:id="85"/>
-    <w:bookmarkStart w:id="86" w:name="f1-score"/>
-    <w:p>
-      <w:pPr>
-        <w:pStyle w:val="Ttulo3"/>
-      </w:pPr>
-      <w:r>
-        <w:rPr>
-          <w:rStyle w:val="SectionNumber"/>
-        </w:rPr>
-        <w:t xml:space="preserve">2.8.5</w:t>
-      </w:r>
-      <w:r>
-        <w:tab/>
-      </w:r>
-      <w:r>
-        <w:t xml:space="preserve">F1-score</w:t>
-      </w:r>
-    </w:p>
-    <w:bookmarkEnd w:id="86"/>
-    <w:bookmarkEnd w:id="87"/>
-    <w:bookmarkEnd w:id="88"/>
-    <w:bookmarkStart w:id="112" w:name="capítulo-3.-estado-del-arte"/>
-    <w:p>
-      <w:pPr>
-        <w:pStyle w:val="Ttulo1"/>
-      </w:pPr>
-      <w:r>
-        <w:rPr>
-          <w:rStyle w:val="SectionNumber"/>
-        </w:rPr>
-        <w:t xml:space="preserve">3</w:t>
-      </w:r>
-      <w:r>
-        <w:tab/>
-      </w:r>
-      <w:r>
-        <w:t xml:space="preserve">Capítulo 3. Estado del Arte</w:t>
-      </w:r>
-    </w:p>
-    <w:bookmarkStart w:id="92" w:name="X72fac63a73a1c1da5fc90463a48c6766cb7a5f0"/>
-    <w:p>
-      <w:pPr>
-        <w:pStyle w:val="Ttulo2"/>
-      </w:pPr>
-      <w:r>
-        <w:rPr>
-          <w:rStyle w:val="SectionNumber"/>
-        </w:rPr>
-        <w:t xml:space="preserve">3.1</w:t>
-      </w:r>
-      <w:r>
-        <w:tab/>
-      </w:r>
-      <w:r>
-        <w:t xml:space="preserve">Variantes lineales del análisis discriminante</w:t>
-      </w:r>
-    </w:p>
-    <w:bookmarkStart w:id="89" w:name="regularized-lda"/>
-    <w:p>
-      <w:pPr>
-        <w:pStyle w:val="Ttulo3"/>
-      </w:pPr>
-      <w:r>
-        <w:rPr>
-          <w:rStyle w:val="SectionNumber"/>
-        </w:rPr>
-        <w:t xml:space="preserve">3.1.1</w:t>
-      </w:r>
-      <w:r>
-        <w:tab/>
-      </w:r>
-      <w:r>
-        <w:t xml:space="preserve">Regularized LDA</w:t>
-      </w:r>
-    </w:p>
-    <w:bookmarkEnd w:id="89"/>
-    <w:bookmarkStart w:id="90" w:name="two-stage-lda"/>
-    <w:p>
-      <w:pPr>
-        <w:pStyle w:val="Ttulo3"/>
-      </w:pPr>
-      <w:r>
-        <w:rPr>
-          <w:rStyle w:val="SectionNumber"/>
-        </w:rPr>
-        <w:t xml:space="preserve">3.1.2</w:t>
-      </w:r>
-      <w:r>
-        <w:tab/>
-      </w:r>
-      <w:r>
-        <w:t xml:space="preserve">Two-Stage LDA</w:t>
-      </w:r>
-    </w:p>
-    <w:bookmarkEnd w:id="90"/>
-    <w:bookmarkStart w:id="91" w:name="variantes-lineales-relevantes"/>
-    <w:p>
-      <w:pPr>
-        <w:pStyle w:val="Ttulo3"/>
-      </w:pPr>
-      <w:r>
-        <w:rPr>
-          <w:rStyle w:val="SectionNumber"/>
-        </w:rPr>
-        <w:t xml:space="preserve">3.1.3</w:t>
-      </w:r>
-      <w:r>
-        <w:tab/>
-      </w:r>
-      <w:r>
-        <w:t xml:space="preserve">Variantes lineales relevantes</w:t>
-      </w:r>
-    </w:p>
-    <w:bookmarkEnd w:id="91"/>
-    <w:bookmarkEnd w:id="92"/>
-    <w:bookmarkStart w:id="97" w:name="métodos-kernel-para-clasificación"/>
-    <w:p>
-      <w:pPr>
-        <w:pStyle w:val="Ttulo2"/>
-      </w:pPr>
-      <w:r>
-        <w:rPr>
-          <w:rStyle w:val="SectionNumber"/>
-        </w:rPr>
-        <w:t xml:space="preserve">3.2</w:t>
-      </w:r>
-      <w:r>
-        <w:tab/>
-      </w:r>
-      <w:r>
-        <w:t xml:space="preserve">Métodos kernel para clasificación</w:t>
-      </w:r>
-    </w:p>
-    <w:bookmarkStart w:id="93" w:name="kernel-pca"/>
-    <w:p>
-      <w:pPr>
-        <w:pStyle w:val="Ttulo3"/>
-      </w:pPr>
-      <w:r>
-        <w:rPr>
-          <w:rStyle w:val="SectionNumber"/>
-        </w:rPr>
-        <w:t xml:space="preserve">3.2.1</w:t>
-      </w:r>
-      <w:r>
-        <w:tab/>
-      </w:r>
-      <w:r>
-        <w:t xml:space="preserve">Kernel PCA</w:t>
-      </w:r>
-    </w:p>
-    <w:bookmarkEnd w:id="93"/>
-    <w:bookmarkStart w:id="94" w:name="kfda-1"/>
-    <w:p>
-      <w:pPr>
-        <w:pStyle w:val="Ttulo3"/>
-      </w:pPr>
-      <w:r>
-        <w:rPr>
-          <w:rStyle w:val="SectionNumber"/>
-        </w:rPr>
-        <w:t xml:space="preserve">3.2.2</w:t>
-      </w:r>
-      <w:r>
-        <w:tab/>
-      </w:r>
-      <w:r>
-        <w:t xml:space="preserve">KFDA</w:t>
-      </w:r>
-    </w:p>
-    <w:bookmarkEnd w:id="94"/>
-    <w:bookmarkStart w:id="95" w:name="svm-polinomial-1"/>
-    <w:p>
-      <w:pPr>
-        <w:pStyle w:val="Ttulo3"/>
-      </w:pPr>
-      <w:r>
-        <w:rPr>
-          <w:rStyle w:val="SectionNumber"/>
-        </w:rPr>
-        <w:t xml:space="preserve">3.2.3</w:t>
-      </w:r>
-      <w:r>
-        <w:tab/>
-      </w:r>
-      <w:r>
-        <w:t xml:space="preserve">SVM Polinomial</w:t>
-      </w:r>
-    </w:p>
-    <w:bookmarkEnd w:id="95"/>
-    <w:bookmarkStart w:id="96" w:name="svm-rbf-1"/>
-    <w:p>
-      <w:pPr>
-        <w:pStyle w:val="Ttulo3"/>
-      </w:pPr>
-      <w:r>
-        <w:rPr>
-          <w:rStyle w:val="SectionNumber"/>
-        </w:rPr>
-        <w:t xml:space="preserve">3.2.4</w:t>
-      </w:r>
-      <w:r>
-        <w:tab/>
-      </w:r>
-      <w:r>
-        <w:t xml:space="preserve">SVM RBF</w:t>
-      </w:r>
-    </w:p>
-    <w:bookmarkEnd w:id="96"/>
-    <w:bookmarkEnd w:id="97"/>
-    <w:bookmarkStart w:id="102" w:name="Xe7307106e4d5f2520de69bd8f877f8022cbdc86"/>
-    <w:p>
-      <w:pPr>
-        <w:pStyle w:val="Ttulo2"/>
-      </w:pPr>
-      <w:r>
-        <w:rPr>
-          <w:rStyle w:val="SectionNumber"/>
-        </w:rPr>
-        <w:t xml:space="preserve">3.3</w:t>
-      </w:r>
-      <w:r>
-        <w:tab/>
-      </w:r>
-      <w:r>
-        <w:t xml:space="preserve">Selección de características basada en algoritmos evolutivos</w:t>
-      </w:r>
-    </w:p>
-    <w:bookmarkStart w:id="98" w:name="ga-para-selección-de-variables"/>
-    <w:p>
-      <w:pPr>
-        <w:pStyle w:val="Ttulo3"/>
-      </w:pPr>
-      <w:r>
-        <w:rPr>
-          <w:rStyle w:val="SectionNumber"/>
-        </w:rPr>
-        <w:t xml:space="preserve">3.3.1</w:t>
-      </w:r>
-      <w:r>
-        <w:tab/>
-      </w:r>
-      <w:r>
-        <w:t xml:space="preserve">GA para selección de variables</w:t>
-      </w:r>
-    </w:p>
-    <w:bookmarkEnd w:id="98"/>
-    <w:bookmarkStart w:id="99" w:name="ga-lda"/>
-    <w:p>
-      <w:pPr>
-        <w:pStyle w:val="Ttulo3"/>
-      </w:pPr>
-      <w:r>
-        <w:rPr>
-          <w:rStyle w:val="SectionNumber"/>
-        </w:rPr>
-        <w:t xml:space="preserve">3.3.2</w:t>
-      </w:r>
-      <w:r>
-        <w:tab/>
-      </w:r>
-      <w:r>
-        <w:t xml:space="preserve">GA + LDA</w:t>
-      </w:r>
-    </w:p>
-    <w:bookmarkEnd w:id="99"/>
-    <w:bookmarkStart w:id="100" w:name="métodos-híbridos"/>
-    <w:p>
-      <w:pPr>
-        <w:pStyle w:val="Ttulo3"/>
-      </w:pPr>
-      <w:r>
-        <w:rPr>
-          <w:rStyle w:val="SectionNumber"/>
-        </w:rPr>
-        <w:t xml:space="preserve">3.3.3</w:t>
-      </w:r>
-      <w:r>
-        <w:tab/>
-      </w:r>
-      <w:r>
-        <w:t xml:space="preserve">Métodos híbridos</w:t>
-      </w:r>
-    </w:p>
-    <w:bookmarkEnd w:id="100"/>
-    <w:bookmarkStart w:id="101" w:name="gpda-y-trabajos-relacionados"/>
-    <w:p>
-      <w:pPr>
-        <w:pStyle w:val="Ttulo3"/>
-      </w:pPr>
-      <w:r>
-        <w:rPr>
-          <w:rStyle w:val="SectionNumber"/>
-        </w:rPr>
-        <w:t xml:space="preserve">3.3.4</w:t>
-      </w:r>
-      <w:r>
-        <w:tab/>
-      </w:r>
-      <w:r>
-        <w:t xml:space="preserve">GPDA y trabajos relacionados</w:t>
-      </w:r>
-    </w:p>
-    <w:bookmarkEnd w:id="101"/>
-    <w:bookmarkEnd w:id="102"/>
-    <w:bookmarkStart w:id="107" w:name="limitaciones-identificadas"/>
-    <w:p>
-      <w:pPr>
-        <w:pStyle w:val="Ttulo2"/>
-      </w:pPr>
-      <w:r>
-        <w:rPr>
-          <w:rStyle w:val="SectionNumber"/>
-        </w:rPr>
-        <w:t xml:space="preserve">3.4</w:t>
-      </w:r>
-      <w:r>
-        <w:tab/>
-      </w:r>
-      <w:r>
-        <w:t xml:space="preserve">Limitaciones identificadas</w:t>
-      </w:r>
-    </w:p>
-    <w:bookmarkStart w:id="103" w:name="explosión-dimensional"/>
-    <w:p>
-      <w:pPr>
-        <w:pStyle w:val="Ttulo3"/>
-      </w:pPr>
-      <w:r>
-        <w:rPr>
-          <w:rStyle w:val="SectionNumber"/>
-        </w:rPr>
-        <w:t xml:space="preserve">3.4.1</w:t>
-      </w:r>
-      <w:r>
-        <w:tab/>
-      </w:r>
-      <w:r>
-        <w:t xml:space="preserve">Explosión dimensional</w:t>
-      </w:r>
-    </w:p>
-    <w:bookmarkEnd w:id="103"/>
-    <w:bookmarkStart w:id="104" w:name="problema-sss"/>
-    <w:p>
-      <w:pPr>
-        <w:pStyle w:val="Ttulo3"/>
-      </w:pPr>
-      <w:r>
-        <w:rPr>
-          <w:rStyle w:val="SectionNumber"/>
-        </w:rPr>
-        <w:t xml:space="preserve">3.4.2</w:t>
-      </w:r>
-      <w:r>
-        <w:tab/>
-      </w:r>
-      <w:r>
-        <w:t xml:space="preserve">Problema SSS</w:t>
-      </w:r>
-    </w:p>
-    <w:bookmarkEnd w:id="104"/>
-    <w:bookmarkStart w:id="105" w:name="pérdida-de-interpretabilidad"/>
-    <w:p>
-      <w:pPr>
-        <w:pStyle w:val="Ttulo3"/>
-      </w:pPr>
-      <w:r>
-        <w:rPr>
-          <w:rStyle w:val="SectionNumber"/>
-        </w:rPr>
-        <w:t xml:space="preserve">3.4.3</w:t>
-      </w:r>
-      <w:r>
-        <w:tab/>
-      </w:r>
-      <w:r>
-        <w:t xml:space="preserve">Pérdida de interpretabilidad</w:t>
-      </w:r>
-    </w:p>
-    <w:bookmarkEnd w:id="105"/>
-    <w:bookmarkStart w:id="106" w:name="costos-computacionales"/>
-    <w:p>
-      <w:pPr>
-        <w:pStyle w:val="Ttulo3"/>
-      </w:pPr>
-      <w:r>
-        <w:rPr>
-          <w:rStyle w:val="SectionNumber"/>
-        </w:rPr>
-        <w:t xml:space="preserve">3.4.4</w:t>
-      </w:r>
-      <w:r>
-        <w:tab/>
-      </w:r>
-      <w:r>
-        <w:t xml:space="preserve">Costos computacionales</w:t>
-      </w:r>
-    </w:p>
-    <w:bookmarkEnd w:id="106"/>
-    <w:bookmarkEnd w:id="107"/>
-    <w:bookmarkStart w:id="111" w:name="posicionamiento-de-gnlpda"/>
-    <w:p>
-      <w:pPr>
-        <w:pStyle w:val="Ttulo2"/>
-      </w:pPr>
-      <w:r>
-        <w:rPr>
-          <w:rStyle w:val="SectionNumber"/>
-        </w:rPr>
-        <w:t xml:space="preserve">3.5</w:t>
-      </w:r>
-      <w:r>
-        <w:tab/>
-      </w:r>
-      <w:r>
-        <w:t xml:space="preserve">Posicionamiento de GNLPDA</w:t>
-      </w:r>
-    </w:p>
-    <w:bookmarkStart w:id="108" w:name="vacío-identificado"/>
-    <w:p>
-      <w:pPr>
-        <w:pStyle w:val="Ttulo3"/>
-      </w:pPr>
-      <w:r>
-        <w:rPr>
-          <w:rStyle w:val="SectionNumber"/>
-        </w:rPr>
-        <w:t xml:space="preserve">3.5.1</w:t>
-      </w:r>
-      <w:r>
-        <w:tab/>
-      </w:r>
-      <w:r>
-        <w:t xml:space="preserve">Vacío identificado</w:t>
-      </w:r>
-    </w:p>
-    <w:bookmarkEnd w:id="108"/>
-    <w:bookmarkStart w:id="109" w:name="justificación-de-la-propuesta"/>
-    <w:p>
-      <w:pPr>
-        <w:pStyle w:val="Ttulo3"/>
-      </w:pPr>
-      <w:r>
-        <w:rPr>
-          <w:rStyle w:val="SectionNumber"/>
-        </w:rPr>
-        <w:t xml:space="preserve">3.5.2</w:t>
-      </w:r>
-      <w:r>
-        <w:tab/>
-      </w:r>
-      <w:r>
-        <w:t xml:space="preserve">Justificación de la propuesta</w:t>
-      </w:r>
-    </w:p>
-    <w:bookmarkEnd w:id="109"/>
-    <w:bookmarkStart w:id="110" w:name="diferencias-respecto-al-estado-del-arte"/>
-    <w:p>
-      <w:pPr>
-        <w:pStyle w:val="Ttulo3"/>
-      </w:pPr>
-      <w:r>
-        <w:rPr>
-          <w:rStyle w:val="SectionNumber"/>
-        </w:rPr>
-        <w:t xml:space="preserve">3.5.3</w:t>
-      </w:r>
-      <w:r>
-        <w:tab/>
-      </w:r>
-      <w:r>
-        <w:t xml:space="preserve">Diferencias respecto al estado del arte</w:t>
-      </w:r>
-    </w:p>
-    <w:bookmarkEnd w:id="110"/>
-    <w:bookmarkEnd w:id="111"/>
-    <w:bookmarkEnd w:id="112"/>
-    <w:bookmarkStart w:id="145" w:name="capítulo-4.-metodología"/>
-    <w:p>
-      <w:pPr>
-        <w:pStyle w:val="Ttulo1"/>
-      </w:pPr>
-      <w:r>
-        <w:rPr>
-          <w:rStyle w:val="SectionNumber"/>
-        </w:rPr>
-        <w:t xml:space="preserve">4</w:t>
-      </w:r>
-      <w:r>
-        <w:tab/>
-      </w:r>
-      <w:r>
-        <w:t xml:space="preserve">Capítulo 4. Metodología</w:t>
-      </w:r>
-    </w:p>
-    <w:bookmarkStart w:id="116" w:name="arquitectura-general-de-gnlpda"/>
-    <w:p>
-      <w:pPr>
-        <w:pStyle w:val="Ttulo2"/>
-      </w:pPr>
-      <w:r>
-        <w:rPr>
-          <w:rStyle w:val="SectionNumber"/>
-        </w:rPr>
-        <w:t xml:space="preserve">4.1</w:t>
-      </w:r>
-      <w:r>
-        <w:tab/>
-      </w:r>
-      <w:r>
-        <w:t xml:space="preserve">Arquitectura general de GNLPDA</w:t>
-      </w:r>
-    </w:p>
-    <w:bookmarkStart w:id="113" w:name="descripción-general"/>
-    <w:p>
-      <w:pPr>
-        <w:pStyle w:val="Ttulo3"/>
-      </w:pPr>
-      <w:r>
-        <w:rPr>
-          <w:rStyle w:val="SectionNumber"/>
-        </w:rPr>
-        <w:t xml:space="preserve">4.1.1</w:t>
-      </w:r>
-      <w:r>
-        <w:tab/>
-      </w:r>
-      <w:r>
-        <w:t xml:space="preserve">Descripción general</w:t>
-      </w:r>
-    </w:p>
-    <w:bookmarkEnd w:id="113"/>
-    <w:bookmarkStart w:id="114" w:name="flujo-del-algoritmo"/>
-    <w:p>
-      <w:pPr>
-        <w:pStyle w:val="Ttulo3"/>
-      </w:pPr>
-      <w:r>
-        <w:rPr>
-          <w:rStyle w:val="SectionNumber"/>
-        </w:rPr>
-        <w:t xml:space="preserve">4.1.2</w:t>
-      </w:r>
-      <w:r>
-        <w:tab/>
-      </w:r>
-      <w:r>
-        <w:t xml:space="preserve">Flujo del algoritmo</w:t>
-      </w:r>
-    </w:p>
-    <w:bookmarkEnd w:id="114"/>
-    <w:bookmarkStart w:id="115" w:name="complejidad-general-del-método"/>
-    <w:p>
-      <w:pPr>
-        <w:pStyle w:val="Ttulo3"/>
-      </w:pPr>
-      <w:r>
-        <w:rPr>
-          <w:rStyle w:val="SectionNumber"/>
-        </w:rPr>
-        <w:t xml:space="preserve">4.1.3</w:t>
-      </w:r>
-      <w:r>
-        <w:tab/>
-      </w:r>
-      <w:r>
-        <w:t xml:space="preserve">Complejidad general del método</w:t>
-      </w:r>
-    </w:p>
-    <w:bookmarkEnd w:id="115"/>
-    <w:bookmarkEnd w:id="116"/>
-    <w:bookmarkStart w:id="119" w:name="expansión-polinomial-1"/>
-    <w:p>
-      <w:pPr>
-        <w:pStyle w:val="Ttulo2"/>
-      </w:pPr>
-      <w:r>
-        <w:rPr>
-          <w:rStyle w:val="SectionNumber"/>
-        </w:rPr>
-        <w:t xml:space="preserve">4.2</w:t>
-      </w:r>
-      <w:r>
-        <w:tab/>
-      </w:r>
-      <w:r>
-        <w:t xml:space="preserve">Expansión polinomial</w:t>
-      </w:r>
-    </w:p>
-    <w:bookmarkStart w:id="117" w:name="generación-de-términos"/>
-    <w:p>
-      <w:pPr>
-        <w:pStyle w:val="Ttulo3"/>
-      </w:pPr>
-      <w:r>
-        <w:rPr>
-          <w:rStyle w:val="SectionNumber"/>
-        </w:rPr>
-        <w:t xml:space="preserve">4.2.1</w:t>
-      </w:r>
-      <w:r>
-        <w:tab/>
-      </w:r>
-      <w:r>
-        <w:t xml:space="preserve">Generación de términos</w:t>
-      </w:r>
-    </w:p>
-    <w:bookmarkEnd w:id="117"/>
-    <w:bookmarkStart w:id="118" w:name="restricción-por-variables-seleccionadas"/>
-    <w:p>
-      <w:pPr>
-        <w:pStyle w:val="Ttulo3"/>
-      </w:pPr>
-      <w:r>
-        <w:rPr>
-          <w:rStyle w:val="SectionNumber"/>
-        </w:rPr>
-        <w:t xml:space="preserve">4.2.2</w:t>
-      </w:r>
-      <w:r>
-        <w:tab/>
-      </w:r>
-      <w:r>
-        <w:t xml:space="preserve">Restricción por variables seleccionadas</w:t>
-      </w:r>
-    </w:p>
-    <w:bookmarkEnd w:id="118"/>
-    <w:bookmarkEnd w:id="119"/>
-    <w:bookmarkStart w:id="123" w:name="fase-i-selección-de-variables-originales"/>
-    <w:p>
-      <w:pPr>
-        <w:pStyle w:val="Ttulo2"/>
-      </w:pPr>
-      <w:r>
-        <w:rPr>
-          <w:rStyle w:val="SectionNumber"/>
-        </w:rPr>
-        <w:t xml:space="preserve">4.3</w:t>
-      </w:r>
-      <w:r>
-        <w:tab/>
-      </w:r>
-      <w:r>
-        <w:t xml:space="preserve">Fase I: Selección de variables originales</w:t>
-      </w:r>
-    </w:p>
-    <w:bookmarkStart w:id="120" w:name="codificación-cromosómica"/>
-    <w:p>
-      <w:pPr>
-        <w:pStyle w:val="Ttulo3"/>
-      </w:pPr>
-      <w:r>
-        <w:rPr>
-          <w:rStyle w:val="SectionNumber"/>
-        </w:rPr>
-        <w:t xml:space="preserve">4.3.1</w:t>
-      </w:r>
-      <w:r>
-        <w:tab/>
-      </w:r>
-      <w:r>
-        <w:t xml:space="preserve">Codificación cromosómica</w:t>
-      </w:r>
-    </w:p>
-    <w:bookmarkEnd w:id="120"/>
-    <w:bookmarkStart w:id="121" w:name="espacio-de-búsqueda"/>
-    <w:p>
-      <w:pPr>
-        <w:pStyle w:val="Ttulo3"/>
-      </w:pPr>
-      <w:r>
-        <w:rPr>
-          <w:rStyle w:val="SectionNumber"/>
-        </w:rPr>
-        <w:t xml:space="preserve">4.3.2</w:t>
-      </w:r>
-      <w:r>
-        <w:tab/>
-      </w:r>
-      <w:r>
-        <w:t xml:space="preserve">Espacio de búsqueda</w:t>
-      </w:r>
-    </w:p>
-    <w:bookmarkEnd w:id="121"/>
-    <w:bookmarkStart w:id="122" w:name="evaluación"/>
-    <w:p>
-      <w:pPr>
-        <w:pStyle w:val="Ttulo3"/>
-      </w:pPr>
-      <w:r>
-        <w:rPr>
-          <w:rStyle w:val="SectionNumber"/>
-        </w:rPr>
-        <w:t xml:space="preserve">4.3.3</w:t>
-      </w:r>
-      <w:r>
-        <w:tab/>
-      </w:r>
-      <w:r>
-        <w:t xml:space="preserve">Evaluación</w:t>
-      </w:r>
-    </w:p>
-    <w:bookmarkEnd w:id="122"/>
-    <w:bookmarkEnd w:id="123"/>
-    <w:bookmarkStart w:id="127" w:name="Xdf32dcaa37b09ddeba2b74e429843214caf4f2f"/>
-    <w:p>
-      <w:pPr>
-        <w:pStyle w:val="Ttulo2"/>
-      </w:pPr>
-      <w:r>
-        <w:rPr>
-          <w:rStyle w:val="SectionNumber"/>
-        </w:rPr>
-        <w:t xml:space="preserve">4.4</w:t>
-      </w:r>
-      <w:r>
-        <w:tab/>
-      </w:r>
-      <w:r>
-        <w:t xml:space="preserve">Fase II: Selección de términos polinomiales</w:t>
-      </w:r>
-    </w:p>
-    <w:bookmarkStart w:id="124" w:name="codificación-cromosómica-1"/>
-    <w:p>
-      <w:pPr>
-        <w:pStyle w:val="Ttulo3"/>
-      </w:pPr>
-      <w:r>
-        <w:rPr>
-          <w:rStyle w:val="SectionNumber"/>
-        </w:rPr>
-        <w:t xml:space="preserve">4.4.1</w:t>
-      </w:r>
-      <w:r>
-        <w:tab/>
-      </w:r>
-      <w:r>
-        <w:t xml:space="preserve">Codificación cromosómica</w:t>
-      </w:r>
-    </w:p>
-    <w:bookmarkEnd w:id="124"/>
-    <w:bookmarkStart w:id="125" w:name="espacio-de-búsqueda-1"/>
-    <w:p>
-      <w:pPr>
-        <w:pStyle w:val="Ttulo3"/>
-      </w:pPr>
-      <w:r>
-        <w:rPr>
-          <w:rStyle w:val="SectionNumber"/>
-        </w:rPr>
-        <w:t xml:space="preserve">4.4.2</w:t>
-      </w:r>
-      <w:r>
-        <w:tab/>
-      </w:r>
-      <w:r>
-        <w:t xml:space="preserve">Espacio de búsqueda</w:t>
-      </w:r>
-    </w:p>
-    <w:bookmarkEnd w:id="125"/>
-    <w:bookmarkStart w:id="126" w:name="evaluación-1"/>
-    <w:p>
-      <w:pPr>
-        <w:pStyle w:val="Ttulo3"/>
-      </w:pPr>
-      <w:r>
-        <w:rPr>
-          <w:rStyle w:val="SectionNumber"/>
-        </w:rPr>
-        <w:t xml:space="preserve">4.4.3</w:t>
-      </w:r>
-      <w:r>
-        <w:tab/>
-      </w:r>
-      <w:r>
-        <w:t xml:space="preserve">Evaluación</w:t>
-      </w:r>
-    </w:p>
-    <w:bookmarkEnd w:id="126"/>
-    <w:bookmarkEnd w:id="127"/>
-    <w:bookmarkStart w:id="131" w:name="función-fitness-1"/>
-    <w:p>
-      <w:pPr>
-        <w:pStyle w:val="Ttulo2"/>
-      </w:pPr>
-      <w:r>
-        <w:rPr>
-          <w:rStyle w:val="SectionNumber"/>
-        </w:rPr>
-        <w:t xml:space="preserve">4.5</w:t>
-      </w:r>
-      <w:r>
-        <w:tab/>
-      </w:r>
-      <w:r>
-        <w:t xml:space="preserve">Función fitness</w:t>
-      </w:r>
-    </w:p>
-    <w:bookmarkStart w:id="128" w:name="accuracy-1"/>
-    <w:p>
-      <w:pPr>
-        <w:pStyle w:val="Ttulo3"/>
-      </w:pPr>
-      <w:r>
-        <w:rPr>
-          <w:rStyle w:val="SectionNumber"/>
-        </w:rPr>
-        <w:t xml:space="preserve">4.5.1</w:t>
-      </w:r>
-      <w:r>
-        <w:tab/>
-      </w:r>
-      <w:r>
-        <w:t xml:space="preserve">Accuracy</w:t>
-      </w:r>
-    </w:p>
-    <w:bookmarkEnd w:id="128"/>
-    <w:bookmarkStart w:id="129" w:name="penalización-por-complejidad"/>
-    <w:p>
-      <w:pPr>
-        <w:pStyle w:val="Ttulo3"/>
-      </w:pPr>
-      <w:r>
-        <w:rPr>
-          <w:rStyle w:val="SectionNumber"/>
-        </w:rPr>
-        <w:t xml:space="preserve">4.5.2</w:t>
-      </w:r>
-      <w:r>
-        <w:tab/>
-      </w:r>
-      <w:r>
-        <w:t xml:space="preserve">Penalización por complejidad</w:t>
-      </w:r>
-    </w:p>
-    <w:bookmarkEnd w:id="129"/>
-    <w:bookmarkStart w:id="130" w:name="fitness-final"/>
-    <w:p>
-      <w:pPr>
-        <w:pStyle w:val="Ttulo3"/>
-      </w:pPr>
-      <w:r>
-        <w:rPr>
-          <w:rStyle w:val="SectionNumber"/>
-        </w:rPr>
-        <w:t xml:space="preserve">4.5.3</w:t>
-      </w:r>
-      <w:r>
-        <w:tab/>
-      </w:r>
-      <w:r>
-        <w:t xml:space="preserve">Fitness final</w:t>
-      </w:r>
-    </w:p>
-    <w:bookmarkEnd w:id="130"/>
-    <w:bookmarkEnd w:id="131"/>
-    <w:bookmarkStart w:id="135" w:name="calibración-mediante-irace"/>
-    <w:p>
-      <w:pPr>
-        <w:pStyle w:val="Ttulo2"/>
-      </w:pPr>
-      <w:r>
-        <w:rPr>
-          <w:rStyle w:val="SectionNumber"/>
-        </w:rPr>
-        <w:t xml:space="preserve">4.6</w:t>
-      </w:r>
-      <w:r>
-        <w:tab/>
-      </w:r>
-      <w:r>
-        <w:t xml:space="preserve">Calibración mediante irace</w:t>
-      </w:r>
-    </w:p>
-    <w:bookmarkStart w:id="132" w:name="parámetros-calibrados"/>
-    <w:p>
-      <w:pPr>
-        <w:pStyle w:val="Ttulo3"/>
-      </w:pPr>
-      <w:r>
-        <w:rPr>
-          <w:rStyle w:val="SectionNumber"/>
-        </w:rPr>
-        <w:t xml:space="preserve">4.6.1</w:t>
-      </w:r>
-      <w:r>
-        <w:tab/>
-      </w:r>
-      <w:r>
-        <w:t xml:space="preserve">Parámetros calibrados</w:t>
-      </w:r>
-    </w:p>
-    <w:bookmarkEnd w:id="132"/>
-    <w:bookmarkStart w:id="133" w:name="escenario-experimental"/>
-    <w:p>
-      <w:pPr>
-        <w:pStyle w:val="Ttulo3"/>
-      </w:pPr>
-      <w:r>
-        <w:rPr>
-          <w:rStyle w:val="SectionNumber"/>
-        </w:rPr>
-        <w:t xml:space="preserve">4.6.2</w:t>
-      </w:r>
-      <w:r>
-        <w:tab/>
-      </w:r>
-      <w:r>
-        <w:t xml:space="preserve">Escenario experimental</w:t>
-      </w:r>
-    </w:p>
-    <w:bookmarkEnd w:id="133"/>
-    <w:bookmarkStart w:id="134" w:name="configuración-seleccionada"/>
-    <w:p>
-      <w:pPr>
-        <w:pStyle w:val="Ttulo3"/>
-      </w:pPr>
-      <w:r>
-        <w:rPr>
-          <w:rStyle w:val="SectionNumber"/>
-        </w:rPr>
-        <w:t xml:space="preserve">4.6.3</w:t>
-      </w:r>
-      <w:r>
-        <w:tab/>
-      </w:r>
-      <w:r>
-        <w:t xml:space="preserve">Configuración seleccionada</w:t>
-      </w:r>
-    </w:p>
-    <w:bookmarkEnd w:id="134"/>
-    <w:bookmarkEnd w:id="135"/>
-    <w:bookmarkStart w:id="144" w:name="diseño-experimental"/>
-    <w:p>
-      <w:pPr>
-        <w:pStyle w:val="Ttulo2"/>
-      </w:pPr>
-      <w:r>
-        <w:rPr>
-          <w:rStyle w:val="SectionNumber"/>
-        </w:rPr>
-        <w:t xml:space="preserve">4.7</w:t>
-      </w:r>
-      <w:r>
-        <w:tab/>
-      </w:r>
-      <w:r>
-        <w:t xml:space="preserve">Diseño experimental</w:t>
-      </w:r>
-    </w:p>
-    <w:bookmarkStart w:id="138" w:name="datasets"/>
-    <w:p>
-      <w:pPr>
-        <w:pStyle w:val="Ttulo3"/>
-      </w:pPr>
-      <w:r>
-        <w:rPr>
-          <w:rStyle w:val="SectionNumber"/>
-        </w:rPr>
-        <w:t xml:space="preserve">4.7.1</w:t>
-      </w:r>
-      <w:r>
-        <w:tab/>
-      </w:r>
-      <w:r>
-        <w:t xml:space="preserve">Datasets</w:t>
-      </w:r>
-    </w:p>
-    <w:bookmarkStart w:id="136" w:name="datasets-reales"/>
-    <w:p>
-      <w:pPr>
-        <w:pStyle w:val="Ttulo4"/>
-      </w:pPr>
-      <w:r>
-        <w:rPr>
-          <w:rStyle w:val="SectionNumber"/>
-        </w:rPr>
-        <w:t xml:space="preserve">4.7.1.1</w:t>
-      </w:r>
-      <w:r>
-        <w:tab/>
-      </w:r>
-      <w:r>
-        <w:t xml:space="preserve">Datasets reales</w:t>
-      </w:r>
-    </w:p>
-    <w:bookmarkEnd w:id="136"/>
-    <w:bookmarkStart w:id="137" w:name="datasets-sintéticos"/>
-    <w:p>
-      <w:pPr>
-        <w:pStyle w:val="Ttulo4"/>
-      </w:pPr>
-      <w:r>
-        <w:rPr>
-          <w:rStyle w:val="SectionNumber"/>
-        </w:rPr>
-        <w:t xml:space="preserve">4.7.1.2</w:t>
-      </w:r>
-      <w:r>
-        <w:tab/>
-      </w:r>
-      <w:r>
-        <w:t xml:space="preserve">Datasets sintéticos</w:t>
-      </w:r>
-    </w:p>
-    <w:bookmarkEnd w:id="137"/>
-    <w:bookmarkEnd w:id="138"/>
-    <w:bookmarkStart w:id="139" w:name="generación-de-datasets-tipo-cebolla"/>
-    <w:p>
-      <w:pPr>
-        <w:pStyle w:val="Ttulo3"/>
-      </w:pPr>
-      <w:r>
-        <w:rPr>
-          <w:rStyle w:val="SectionNumber"/>
-        </w:rPr>
-        <w:t xml:space="preserve">4.7.2</w:t>
-      </w:r>
-      <w:r>
-        <w:tab/>
-      </w:r>
-      <w:r>
-        <w:t xml:space="preserve">Generación de datasets tipo cebolla</w:t>
-      </w:r>
-    </w:p>
-    <w:bookmarkEnd w:id="139"/>
-    <w:bookmarkStart w:id="140" w:name="competidores"/>
-    <w:p>
-      <w:pPr>
-        <w:pStyle w:val="Ttulo3"/>
-      </w:pPr>
-      <w:r>
-        <w:rPr>
-          <w:rStyle w:val="SectionNumber"/>
-        </w:rPr>
-        <w:t xml:space="preserve">4.7.3</w:t>
-      </w:r>
-      <w:r>
-        <w:tab/>
-      </w:r>
-      <w:r>
-        <w:t xml:space="preserve">Competidores</w:t>
-      </w:r>
-    </w:p>
-    <w:bookmarkEnd w:id="140"/>
-    <w:bookmarkStart w:id="141" w:name="particiones"/>
-    <w:p>
-      <w:pPr>
-        <w:pStyle w:val="Ttulo3"/>
-      </w:pPr>
-      <w:r>
-        <w:rPr>
-          <w:rStyle w:val="SectionNumber"/>
-        </w:rPr>
-        <w:t xml:space="preserve">4.7.4</w:t>
-      </w:r>
-      <w:r>
-        <w:tab/>
-      </w:r>
-      <w:r>
-        <w:t xml:space="preserve">Particiones</w:t>
-      </w:r>
-    </w:p>
-    <w:bookmarkEnd w:id="141"/>
-    <w:bookmarkStart w:id="142" w:name="validación"/>
-    <w:p>
-      <w:pPr>
-        <w:pStyle w:val="Ttulo3"/>
-      </w:pPr>
-      <w:r>
-        <w:rPr>
-          <w:rStyle w:val="SectionNumber"/>
-        </w:rPr>
-        <w:t xml:space="preserve">4.7.5</w:t>
-      </w:r>
-      <w:r>
-        <w:tab/>
-      </w:r>
-      <w:r>
-        <w:t xml:space="preserve">Validación</w:t>
-      </w:r>
-    </w:p>
-    <w:bookmarkEnd w:id="142"/>
-    <w:bookmarkStart w:id="143" w:name="análisis-estadístico"/>
-    <w:p>
-      <w:pPr>
-        <w:pStyle w:val="Ttulo3"/>
-      </w:pPr>
-      <w:r>
-        <w:rPr>
-          <w:rStyle w:val="SectionNumber"/>
-        </w:rPr>
-        <w:t xml:space="preserve">4.7.6</w:t>
-      </w:r>
-      <w:r>
-        <w:tab/>
-      </w:r>
-      <w:r>
-        <w:t xml:space="preserve">Análisis estadístico</w:t>
-      </w:r>
-    </w:p>
-    <w:bookmarkEnd w:id="143"/>
-    <w:bookmarkEnd w:id="144"/>
-    <w:bookmarkEnd w:id="145"/>
-    <w:bookmarkStart w:id="172" w:name="capítulo-5.-resultados"/>
-    <w:p>
-      <w:pPr>
-        <w:pStyle w:val="Ttulo1"/>
-      </w:pPr>
-      <w:r>
-        <w:rPr>
-          <w:rStyle w:val="SectionNumber"/>
-        </w:rPr>
-        <w:t xml:space="preserve">5</w:t>
-      </w:r>
-      <w:r>
-        <w:tab/>
-      </w:r>
-      <w:r>
-        <w:t xml:space="preserve">Capítulo 5. Resultados</w:t>
-      </w:r>
-    </w:p>
-    <w:bookmarkStart w:id="151" w:name="caracterización-de-datasets"/>
-    <w:p>
-      <w:pPr>
-        <w:pStyle w:val="Ttulo2"/>
-      </w:pPr>
-      <w:r>
-        <w:rPr>
-          <w:rStyle w:val="SectionNumber"/>
-        </w:rPr>
-        <w:t xml:space="preserve">5.1</w:t>
-      </w:r>
-      <w:r>
-        <w:tab/>
-      </w:r>
-      <w:r>
-        <w:t xml:space="preserve">Caracterización de datasets</w:t>
-      </w:r>
-    </w:p>
-    <w:bookmarkStart w:id="146" w:name="datasets-sintéticos-1"/>
-    <w:p>
-      <w:pPr>
-        <w:pStyle w:val="Ttulo3"/>
-      </w:pPr>
-      <w:r>
-        <w:rPr>
-          <w:rStyle w:val="SectionNumber"/>
-        </w:rPr>
-        <w:t xml:space="preserve">5.1.1</w:t>
-      </w:r>
-      <w:r>
-        <w:tab/>
-      </w:r>
-      <w:r>
-        <w:t xml:space="preserve">Datasets sintéticos</w:t>
-      </w:r>
-    </w:p>
-    <w:bookmarkEnd w:id="146"/>
-    <w:bookmarkStart w:id="147" w:name="datasets-reales-1"/>
-    <w:p>
-      <w:pPr>
-        <w:pStyle w:val="Ttulo3"/>
-      </w:pPr>
-      <w:r>
-        <w:rPr>
-          <w:rStyle w:val="SectionNumber"/>
-        </w:rPr>
-        <w:t xml:space="preserve">5.1.2</w:t>
-      </w:r>
-      <w:r>
-        <w:tab/>
-      </w:r>
-      <w:r>
-        <w:t xml:space="preserve">Datasets reales</w:t>
-      </w:r>
-    </w:p>
-    <w:bookmarkEnd w:id="147"/>
-    <w:bookmarkStart w:id="148" w:name="estadísticas-descriptivas"/>
-    <w:p>
-      <w:pPr>
-        <w:pStyle w:val="Ttulo3"/>
-      </w:pPr>
-      <w:r>
-        <w:rPr>
-          <w:rStyle w:val="SectionNumber"/>
-        </w:rPr>
-        <w:t xml:space="preserve">5.1.3</w:t>
-      </w:r>
-      <w:r>
-        <w:tab/>
-      </w:r>
-      <w:r>
-        <w:t xml:space="preserve">Estadísticas descriptivas</w:t>
-      </w:r>
-    </w:p>
-    <w:bookmarkEnd w:id="148"/>
-    <w:bookmarkStart w:id="149" w:name="pairplots-y-análisis-exploratorio"/>
-    <w:p>
-      <w:pPr>
-        <w:pStyle w:val="Ttulo3"/>
-      </w:pPr>
-      <w:r>
-        <w:rPr>
-          <w:rStyle w:val="SectionNumber"/>
-        </w:rPr>
-        <w:t xml:space="preserve">5.1.4</w:t>
-      </w:r>
-      <w:r>
-        <w:tab/>
-      </w:r>
-      <w:r>
-        <w:t xml:space="preserve">Pairplots y análisis exploratorio</w:t>
-      </w:r>
-    </w:p>
-    <w:bookmarkEnd w:id="149"/>
-    <w:bookmarkStart w:id="150" w:name="observaciones-preliminares"/>
-    <w:p>
-      <w:pPr>
-        <w:pStyle w:val="Ttulo3"/>
-      </w:pPr>
-      <w:r>
-        <w:rPr>
-          <w:rStyle w:val="SectionNumber"/>
-        </w:rPr>
-        <w:t xml:space="preserve">5.1.5</w:t>
-      </w:r>
-      <w:r>
-        <w:tab/>
-      </w:r>
-      <w:r>
-        <w:t xml:space="preserve">Observaciones preliminares</w:t>
-      </w:r>
-    </w:p>
-    <w:bookmarkEnd w:id="150"/>
-    <w:bookmarkEnd w:id="151"/>
-    <w:bookmarkStart w:id="157" w:name="estudio-del-problema-sss"/>
-    <w:p>
-      <w:pPr>
-        <w:pStyle w:val="Ttulo2"/>
-      </w:pPr>
-      <w:r>
-        <w:rPr>
-          <w:rStyle w:val="SectionNumber"/>
-        </w:rPr>
-        <w:t xml:space="preserve">5.2</w:t>
-      </w:r>
-      <w:r>
-        <w:tab/>
-      </w:r>
-      <w:r>
-        <w:t xml:space="preserve">Estudio del problema SSS</w:t>
-      </w:r>
-    </w:p>
-    <w:bookmarkStart w:id="152" w:name="escenarios-evaluados"/>
-    <w:p>
-      <w:pPr>
-        <w:pStyle w:val="Ttulo3"/>
-      </w:pPr>
-      <w:r>
-        <w:rPr>
-          <w:rStyle w:val="SectionNumber"/>
-        </w:rPr>
-        <w:t xml:space="preserve">5.2.1</w:t>
-      </w:r>
-      <w:r>
-        <w:tab/>
-      </w:r>
-      <w:r>
-        <w:t xml:space="preserve">Escenarios evaluados</w:t>
-      </w:r>
-    </w:p>
-    <w:bookmarkEnd w:id="152"/>
-    <w:bookmarkStart w:id="153" w:name="lda-clásico"/>
-    <w:p>
-      <w:pPr>
-        <w:pStyle w:val="Ttulo3"/>
-      </w:pPr>
-      <w:r>
-        <w:rPr>
-          <w:rStyle w:val="SectionNumber"/>
-        </w:rPr>
-        <w:t xml:space="preserve">5.2.2</w:t>
-      </w:r>
-      <w:r>
-        <w:tab/>
-      </w:r>
-      <w:r>
-        <w:t xml:space="preserve">LDA clásico</w:t>
-      </w:r>
-    </w:p>
-    <w:bookmarkEnd w:id="153"/>
-    <w:bookmarkStart w:id="154" w:name="mass-lda"/>
-    <w:p>
-      <w:pPr>
-        <w:pStyle w:val="Ttulo3"/>
-      </w:pPr>
-      <w:r>
-        <w:rPr>
-          <w:rStyle w:val="SectionNumber"/>
-        </w:rPr>
-        <w:t xml:space="preserve">5.2.3</w:t>
-      </w:r>
-      <w:r>
-        <w:tab/>
-      </w:r>
-      <w:r>
-        <w:t xml:space="preserve">MASS-LDA</w:t>
-      </w:r>
-    </w:p>
-    <w:bookmarkEnd w:id="154"/>
-    <w:bookmarkStart w:id="155" w:name="kfda-2"/>
-    <w:p>
-      <w:pPr>
-        <w:pStyle w:val="Ttulo3"/>
-      </w:pPr>
-      <w:r>
-        <w:rPr>
-          <w:rStyle w:val="SectionNumber"/>
-        </w:rPr>
-        <w:t xml:space="preserve">5.2.4</w:t>
-      </w:r>
-      <w:r>
-        <w:tab/>
-      </w:r>
-      <w:r>
-        <w:t xml:space="preserve">KFDA</w:t>
-      </w:r>
-    </w:p>
-    <w:bookmarkEnd w:id="155"/>
-    <w:bookmarkStart w:id="156" w:name="discusión"/>
-    <w:p>
-      <w:pPr>
-        <w:pStyle w:val="Ttulo3"/>
-      </w:pPr>
-      <w:r>
-        <w:rPr>
-          <w:rStyle w:val="SectionNumber"/>
-        </w:rPr>
-        <w:t xml:space="preserve">5.2.5</w:t>
-      </w:r>
-      <w:r>
-        <w:tab/>
-      </w:r>
-      <w:r>
-        <w:t xml:space="preserve">Discusión</w:t>
-      </w:r>
-    </w:p>
-    <w:bookmarkEnd w:id="156"/>
-    <w:bookmarkEnd w:id="157"/>
-    <w:bookmarkStart w:id="162" w:name="visualización-de-proyecciones"/>
-    <w:p>
-      <w:pPr>
-        <w:pStyle w:val="Ttulo2"/>
-      </w:pPr>
-      <w:r>
-        <w:rPr>
-          <w:rStyle w:val="SectionNumber"/>
-        </w:rPr>
-        <w:t xml:space="preserve">5.3</w:t>
-      </w:r>
-      <w:r>
-        <w:tab/>
-      </w:r>
-      <w:r>
-        <w:t xml:space="preserve">Visualización de proyecciones</w:t>
-      </w:r>
-    </w:p>
-    <w:bookmarkStart w:id="158" w:name="lda"/>
-    <w:p>
-      <w:pPr>
-        <w:pStyle w:val="Ttulo3"/>
-      </w:pPr>
-      <w:r>
-        <w:rPr>
-          <w:rStyle w:val="SectionNumber"/>
-        </w:rPr>
-        <w:t xml:space="preserve">5.3.1</w:t>
-      </w:r>
-      <w:r>
-        <w:tab/>
-      </w:r>
-      <w:r>
-        <w:t xml:space="preserve">LDA</w:t>
-      </w:r>
-    </w:p>
-    <w:bookmarkEnd w:id="158"/>
-    <w:bookmarkStart w:id="159" w:name="kfda-3"/>
-    <w:p>
-      <w:pPr>
-        <w:pStyle w:val="Ttulo3"/>
-      </w:pPr>
-      <w:r>
-        <w:rPr>
-          <w:rStyle w:val="SectionNumber"/>
-        </w:rPr>
-        <w:t xml:space="preserve">5.3.2</w:t>
-      </w:r>
-      <w:r>
-        <w:tab/>
-      </w:r>
-      <w:r>
-        <w:t xml:space="preserve">KFDA</w:t>
-      </w:r>
-    </w:p>
-    <w:bookmarkEnd w:id="159"/>
-    <w:bookmarkStart w:id="160" w:name="gnlpda"/>
-    <w:p>
-      <w:pPr>
-        <w:pStyle w:val="Ttulo3"/>
-      </w:pPr>
-      <w:r>
-        <w:rPr>
-          <w:rStyle w:val="SectionNumber"/>
-        </w:rPr>
-        <w:t xml:space="preserve">5.3.3</w:t>
-      </w:r>
-      <w:r>
-        <w:tab/>
-      </w:r>
-      <w:r>
-        <w:t xml:space="preserve">GNLPDA</w:t>
-      </w:r>
-    </w:p>
-    <w:bookmarkEnd w:id="160"/>
-    <w:bookmarkStart w:id="161" w:name="comparación-visual"/>
-    <w:p>
-      <w:pPr>
-        <w:pStyle w:val="Ttulo3"/>
-      </w:pPr>
-      <w:r>
-        <w:rPr>
-          <w:rStyle w:val="SectionNumber"/>
-        </w:rPr>
-        <w:t xml:space="preserve">5.3.4</w:t>
-      </w:r>
-      <w:r>
-        <w:tab/>
-      </w:r>
-      <w:r>
-        <w:t xml:space="preserve">Comparación visual</w:t>
-      </w:r>
-    </w:p>
-    <w:bookmarkEnd w:id="161"/>
-    <w:bookmarkEnd w:id="162"/>
-    <w:bookmarkStart w:id="167" w:name="comparación-global-entre-métodos"/>
-    <w:p>
-      <w:pPr>
-        <w:pStyle w:val="Ttulo2"/>
-      </w:pPr>
-      <w:r>
-        <w:rPr>
-          <w:rStyle w:val="SectionNumber"/>
-        </w:rPr>
-        <w:t xml:space="preserve">5.4</w:t>
-      </w:r>
-      <w:r>
-        <w:tab/>
-      </w:r>
-      <w:r>
-        <w:t xml:space="preserve">Comparación global entre métodos</w:t>
-      </w:r>
-    </w:p>
-    <w:bookmarkStart w:id="163" w:name="accuracy-2"/>
-    <w:p>
-      <w:pPr>
-        <w:pStyle w:val="Ttulo3"/>
-      </w:pPr>
-      <w:r>
-        <w:rPr>
-          <w:rStyle w:val="SectionNumber"/>
-        </w:rPr>
-        <w:t xml:space="preserve">5.4.1</w:t>
-      </w:r>
-      <w:r>
-        <w:tab/>
-      </w:r>
-      <w:r>
-        <w:t xml:space="preserve">Accuracy</w:t>
-      </w:r>
-    </w:p>
-    <w:bookmarkEnd w:id="163"/>
-    <w:bookmarkStart w:id="164" w:name="precision-1"/>
-    <w:p>
-      <w:pPr>
-        <w:pStyle w:val="Ttulo3"/>
-      </w:pPr>
-      <w:r>
-        <w:rPr>
-          <w:rStyle w:val="SectionNumber"/>
-        </w:rPr>
-        <w:t xml:space="preserve">5.4.2</w:t>
-      </w:r>
-      <w:r>
-        <w:tab/>
-      </w:r>
-      <w:r>
-        <w:t xml:space="preserve">Precision</w:t>
-      </w:r>
-    </w:p>
-    <w:bookmarkEnd w:id="164"/>
-    <w:bookmarkStart w:id="165" w:name="recall-1"/>
-    <w:p>
-      <w:pPr>
-        <w:pStyle w:val="Ttulo3"/>
-      </w:pPr>
-      <w:r>
-        <w:rPr>
-          <w:rStyle w:val="SectionNumber"/>
-        </w:rPr>
-        <w:t xml:space="preserve">5.4.3</w:t>
-      </w:r>
-      <w:r>
-        <w:tab/>
-      </w:r>
-      <w:r>
-        <w:t xml:space="preserve">Recall</w:t>
-      </w:r>
-    </w:p>
-    <w:bookmarkEnd w:id="165"/>
-    <w:bookmarkStart w:id="166" w:name="f1-score-1"/>
-    <w:p>
-      <w:pPr>
-        <w:pStyle w:val="Ttulo3"/>
-      </w:pPr>
-      <w:r>
-        <w:rPr>
-          <w:rStyle w:val="SectionNumber"/>
-        </w:rPr>
-        <w:t xml:space="preserve">5.4.4</w:t>
-      </w:r>
-      <w:r>
-        <w:tab/>
-      </w:r>
-      <w:r>
-        <w:t xml:space="preserve">F1-score</w:t>
-      </w:r>
-    </w:p>
-    <w:bookmarkEnd w:id="166"/>
-    <w:bookmarkEnd w:id="167"/>
-    <w:bookmarkStart w:id="171" w:name="análisis-técnico-y-estadístico"/>
-    <w:p>
-      <w:pPr>
-        <w:pStyle w:val="Ttulo2"/>
-      </w:pPr>
-      <w:r>
-        <w:rPr>
-          <w:rStyle w:val="SectionNumber"/>
-        </w:rPr>
-        <w:t xml:space="preserve">5.5</w:t>
-      </w:r>
-      <w:r>
-        <w:tab/>
-      </w:r>
-      <w:r>
-        <w:t xml:space="preserve">Análisis Técnico y Estadístico</w:t>
-      </w:r>
-    </w:p>
-    <w:bookmarkStart w:id="168" w:name="friedman"/>
-    <w:p>
-      <w:pPr>
-        <w:pStyle w:val="Ttulo3"/>
-      </w:pPr>
-      <w:r>
-        <w:rPr>
-          <w:rStyle w:val="SectionNumber"/>
-        </w:rPr>
-        <w:t xml:space="preserve">5.5.1</w:t>
-      </w:r>
-      <w:r>
-        <w:tab/>
-      </w:r>
-      <w:r>
-        <w:t xml:space="preserve">Friedman</w:t>
-      </w:r>
-    </w:p>
-    <w:bookmarkEnd w:id="168"/>
-    <w:bookmarkStart w:id="169" w:name="nemenyi"/>
-    <w:p>
-      <w:pPr>
-        <w:pStyle w:val="Ttulo3"/>
-      </w:pPr>
-      <w:r>
-        <w:rPr>
-          <w:rStyle w:val="SectionNumber"/>
-        </w:rPr>
-        <w:t xml:space="preserve">5.5.2</w:t>
-      </w:r>
-      <w:r>
-        <w:tab/>
-      </w:r>
-      <w:r>
-        <w:t xml:space="preserve">Nemenyi</w:t>
-      </w:r>
-    </w:p>
-    <w:bookmarkEnd w:id="169"/>
-    <w:bookmarkStart w:id="170" w:name="interpretación"/>
-    <w:p>
-      <w:pPr>
-        <w:pStyle w:val="Ttulo3"/>
-      </w:pPr>
-      <w:r>
-        <w:rPr>
-          <w:rStyle w:val="SectionNumber"/>
-        </w:rPr>
-        <w:t xml:space="preserve">5.5.3</w:t>
-      </w:r>
-      <w:r>
-        <w:tab/>
-      </w:r>
-      <w:r>
-        <w:t xml:space="preserve">Interpretación</w:t>
-      </w:r>
-    </w:p>
-    <w:bookmarkEnd w:id="170"/>
-    <w:bookmarkEnd w:id="171"/>
-    <w:bookmarkEnd w:id="172"/>
-    <w:bookmarkStart w:id="178" w:name="capítulo-6.-discusión"/>
-    <w:p>
-      <w:pPr>
-        <w:pStyle w:val="Ttulo1"/>
-      </w:pPr>
-      <w:r>
-        <w:rPr>
-          <w:rStyle w:val="SectionNumber"/>
-        </w:rPr>
-        <w:t xml:space="preserve">6</w:t>
-      </w:r>
-      <w:r>
-        <w:tab/>
-      </w:r>
-      <w:r>
-        <w:t xml:space="preserve">Capítulo 6. Discusión</w:t>
-      </w:r>
-    </w:p>
-    <w:bookmarkStart w:id="173" w:name="interpretación-geométrica"/>
-    <w:p>
-      <w:pPr>
-        <w:pStyle w:val="Ttulo2"/>
-      </w:pPr>
-      <w:r>
-        <w:rPr>
-          <w:rStyle w:val="SectionNumber"/>
-        </w:rPr>
-        <w:t xml:space="preserve">6.1</w:t>
-      </w:r>
-      <w:r>
-        <w:tab/>
-      </w:r>
-      <w:r>
-        <w:t xml:space="preserve">Interpretación geométrica</w:t>
-      </w:r>
-    </w:p>
-    <w:bookmarkEnd w:id="173"/>
-    <w:bookmarkStart w:id="174" w:name="interpretación-estadística"/>
-    <w:p>
-      <w:pPr>
-        <w:pStyle w:val="Ttulo2"/>
-      </w:pPr>
-      <w:r>
-        <w:rPr>
-          <w:rStyle w:val="SectionNumber"/>
-        </w:rPr>
-        <w:t xml:space="preserve">6.2</w:t>
-      </w:r>
-      <w:r>
-        <w:tab/>
-      </w:r>
-      <w:r>
-        <w:t xml:space="preserve">Interpretación estadística</w:t>
-      </w:r>
-    </w:p>
-    <w:bookmarkEnd w:id="174"/>
-    <w:bookmarkStart w:id="175" w:name="fortalezas-de-gnlpda"/>
-    <w:p>
-      <w:pPr>
-        <w:pStyle w:val="Ttulo2"/>
-      </w:pPr>
-      <w:r>
-        <w:rPr>
-          <w:rStyle w:val="SectionNumber"/>
-        </w:rPr>
-        <w:t xml:space="preserve">6.3</w:t>
-      </w:r>
-      <w:r>
-        <w:tab/>
-      </w:r>
-      <w:r>
-        <w:t xml:space="preserve">Fortalezas de GNLPDA</w:t>
-      </w:r>
-    </w:p>
-    <w:bookmarkEnd w:id="175"/>
-    <w:bookmarkStart w:id="176" w:name="limitaciones-identificadas-1"/>
-    <w:p>
-      <w:pPr>
-        <w:pStyle w:val="Ttulo2"/>
-      </w:pPr>
-      <w:r>
-        <w:rPr>
-          <w:rStyle w:val="SectionNumber"/>
-        </w:rPr>
-        <w:t xml:space="preserve">6.4</w:t>
-      </w:r>
-      <w:r>
-        <w:tab/>
-      </w:r>
-      <w:r>
-        <w:t xml:space="preserve">Limitaciones identificadas</w:t>
-      </w:r>
-    </w:p>
-    <w:bookmarkEnd w:id="176"/>
-    <w:bookmarkStart w:id="177" w:name="amenazas-a-la-validez"/>
-    <w:p>
-      <w:pPr>
-        <w:pStyle w:val="Ttulo2"/>
-      </w:pPr>
-      <w:r>
-        <w:rPr>
-          <w:rStyle w:val="SectionNumber"/>
-        </w:rPr>
-        <w:t xml:space="preserve">6.5</w:t>
-      </w:r>
-      <w:r>
-        <w:tab/>
-      </w:r>
-      <w:r>
-        <w:t xml:space="preserve">Amenazas a la validez</w:t>
-      </w:r>
-    </w:p>
-    <w:bookmarkEnd w:id="177"/>
-    <w:bookmarkEnd w:id="178"/>
-    <w:bookmarkStart w:id="183" w:name="capítulo-7.-conclusiones"/>
-    <w:p>
-      <w:pPr>
-        <w:pStyle w:val="Ttulo1"/>
-      </w:pPr>
-      <w:r>
-        <w:rPr>
-          <w:rStyle w:val="SectionNumber"/>
-        </w:rPr>
-        <w:t xml:space="preserve">7</w:t>
-      </w:r>
-      <w:r>
-        <w:tab/>
-      </w:r>
-      <w:r>
-        <w:t xml:space="preserve">Capítulo 7. Conclusiones</w:t>
-      </w:r>
-    </w:p>
-    <w:bookmarkStart w:id="179" w:name="conclusiones"/>
-    <w:p>
-      <w:pPr>
-        <w:pStyle w:val="Ttulo2"/>
-      </w:pPr>
-      <w:r>
-        <w:rPr>
-          <w:rStyle w:val="SectionNumber"/>
-        </w:rPr>
-        <w:t xml:space="preserve">7.1</w:t>
-      </w:r>
-      <w:r>
-        <w:tab/>
-      </w:r>
-      <w:r>
-        <w:t xml:space="preserve">Conclusiones</w:t>
-      </w:r>
-    </w:p>
-    <w:bookmarkEnd w:id="179"/>
-    <w:bookmarkStart w:id="180" w:name="cumplimiento-de-objetivos"/>
-    <w:p>
-      <w:pPr>
-        <w:pStyle w:val="Ttulo2"/>
-      </w:pPr>
-      <w:r>
-        <w:rPr>
-          <w:rStyle w:val="SectionNumber"/>
-        </w:rPr>
-        <w:t xml:space="preserve">7.2</w:t>
-      </w:r>
-      <w:r>
-        <w:tab/>
-      </w:r>
-      <w:r>
-        <w:t xml:space="preserve">Cumplimiento de objetivos</w:t>
-      </w:r>
-    </w:p>
-    <w:bookmarkEnd w:id="180"/>
-    <w:bookmarkStart w:id="181" w:name="contribuciones-1"/>
-    <w:p>
-      <w:pPr>
-        <w:pStyle w:val="Ttulo2"/>
-      </w:pPr>
-      <w:r>
-        <w:rPr>
-          <w:rStyle w:val="SectionNumber"/>
-        </w:rPr>
-        <w:t xml:space="preserve">7.3</w:t>
-      </w:r>
-      <w:r>
-        <w:tab/>
-      </w:r>
-      <w:r>
-        <w:t xml:space="preserve">Contribuciones</w:t>
-      </w:r>
-    </w:p>
-    <w:bookmarkEnd w:id="181"/>
-    <w:bookmarkStart w:id="182" w:name="trabajo-futuro"/>
-    <w:p>
-      <w:pPr>
-        <w:pStyle w:val="Ttulo2"/>
-      </w:pPr>
-      <w:r>
-        <w:rPr>
-          <w:rStyle w:val="SectionNumber"/>
-        </w:rPr>
-        <w:t xml:space="preserve">7.4</w:t>
-      </w:r>
-      <w:r>
-        <w:tab/>
-      </w:r>
-      <w:r>
-        <w:t xml:space="preserve">Trabajo futuro</w:t>
-      </w:r>
-    </w:p>
-    <w:bookmarkEnd w:id="182"/>
-    <w:bookmarkEnd w:id="183"/>
     <w:sectPr>
       <w:headerReference r:id="rId13" w:type="default"/>
       <w:footerReference r:id="rId19" w:type="even"/>

</xml_diff>